<commit_message>
docs(plant-floor): Arc-2 plan v1.2 validation + task list + Phase 0 decision log
</commit_message>
<xml_diff>
--- a/MPP_MES_PHASED_PLAN_PLANT_FLOOR.docx
+++ b/MPP_MES_PHASED_PLAN_PLANT_FLOOR.docx
@@ -26,7 +26,7 @@
         <w:t xml:space="preserve"> </w:t>
       </w:r>
       <w:r>
-        <w:t xml:space="preserve">MPP-PLAN-ARC2-v1.0</w:t>
+        <w:t xml:space="preserve">MPP-PLAN-ARC2-v1.3</w:t>
       </w:r>
       <w:r>
         <w:t xml:space="preserve"> </w:t>
@@ -74,7 +74,7 @@
         <w:t xml:space="preserve"> </w:t>
       </w:r>
       <w:r>
-        <w:t xml:space="preserve">1.1 (2026-06-03)</w:t>
+        <w:t xml:space="preserve">1.3 (2026-06-08)</w:t>
       </w:r>
       <w:r>
         <w:t xml:space="preserve"> </w:t>
@@ -90,7 +90,7 @@
         <w:t xml:space="preserve"> </w:t>
       </w:r>
       <w:r>
-        <w:t xml:space="preserve">Working draft — full rebuild against current source-of-truth docs (FDS v0.11m, Data Model v1.9l, User Journeys v0.9, Open Issues Register v2.16, Seeding Registry v1.0). Supersedes the v0.1 → v0.3 line; the prior draft chain is retained in git history.</w:t>
+        <w:t xml:space="preserve">Working draft — full rebuild against current source-of-truth docs (FDS v1.3, Data Model v1.9q, User Journeys v0.9, Open Issues Register v2.17, Seeding Registry v1.0). Supersedes the v0.1 → v0.3 line; the prior draft chain is retained in git history.</w:t>
       </w:r>
     </w:p>
     <w:p>
@@ -125,24 +125,6 @@
       </w:r>
       <w:r>
         <w:t xml:space="preserve">— MPP-owned customer validation and Blue Ridge–owned architecture decisions (OI-35) — both must complete before Phase 1 SQL build commences. Per-phase narratives reference current source-of-truth docs by version; updates to those docs propagate here at the next plan revision.</w:t>
-      </w:r>
-    </w:p>
-    <w:p>
-      <w:pPr>
-        <w:pStyle w:val="BlockText"/>
-      </w:pPr>
-      <w:r>
-        <w:rPr>
-          <w:b/>
-          <w:bCs/>
-        </w:rPr>
-        <w:t xml:space="preserve">In-progress note (v1.0a, 2026-04-29):</w:t>
-      </w:r>
-      <w:r>
-        <w:t xml:space="preserve"> </w:t>
-      </w:r>
-      <w:r>
-        <w:t xml:space="preserve">This file currently contains Phases 0–4 of the rebuild. Phases 5–8 are placeholders awaiting review of the first half. The closing sections (Out of Scope, Open Items Affecting This Plan, Related Documents) will land with Phases 5–8.</w:t>
       </w:r>
     </w:p>
     <w:p>
@@ -267,18 +249,18 @@
               <w:pStyle w:val="Compact"/>
             </w:pPr>
             <w:r>
-              <w:t xml:space="preserve">1.1</w:t>
-            </w:r>
-          </w:p>
-        </w:tc>
-        <w:tc>
-          <w:tcPr/>
-          <w:p>
-            <w:pPr>
-              <w:pStyle w:val="Compact"/>
-            </w:pPr>
-            <w:r>
-              <w:t xml:space="preserve">2026-06-03</w:t>
+              <w:t xml:space="preserve">1.3</w:t>
+            </w:r>
+          </w:p>
+        </w:tc>
+        <w:tc>
+          <w:tcPr/>
+          <w:p>
+            <w:pPr>
+              <w:pStyle w:val="Compact"/>
+            </w:pPr>
+            <w:r>
+              <w:t xml:space="preserve">2026-06-08</w:t>
             </w:r>
           </w:p>
         </w:tc>
@@ -304,13 +286,13 @@
                 <w:b/>
                 <w:bCs/>
               </w:rPr>
-              <w:t xml:space="preserve">Sub-LOT split relocated from Trim OUT to Machining OUT</w:t>
-            </w:r>
-            <w:r>
-              <w:t xml:space="preserve"> </w:t>
-            </w:r>
-            <w:r>
-              <w:t xml:space="preserve">(per MPP, confirmed 2026-06 — settled, not an open item). Reverses the v1.0 driver-(a) claim that the split sits at Trim OUT. Trim is now a</w:t>
+              <w:t xml:space="preserve">MVP scope decisions ratified (2026-06-08) + migration re-baseline.</w:t>
+            </w:r>
+            <w:r>
+              <w:t xml:space="preserve"> </w:t>
+            </w:r>
+            <w:r>
+              <w:t xml:space="preserve">(1)</w:t>
             </w:r>
             <w:r>
               <w:t xml:space="preserve"> </w:t>
@@ -320,40 +302,43 @@
                 <w:b/>
                 <w:bCs/>
               </w:rPr>
-              <w:t xml:space="preserve">1:1 whole-LOT move tracked at Area resolution</w:t>
-            </w:r>
-            <w:r>
-              <w:t xml:space="preserve">; the</w:t>
-            </w:r>
-            <w:r>
-              <w:t xml:space="preserve"> </w:t>
-            </w:r>
-            <w:r>
-              <w:rPr>
-                <w:rStyle w:val="VerbatimChar"/>
-              </w:rPr>
-              <w:t xml:space="preserve">Parts.OperationTemplate.RequiresSubLotSplit</w:t>
-            </w:r>
-            <w:r>
-              <w:t xml:space="preserve"> </w:t>
-            </w:r>
-            <w:r>
-              <w:t xml:space="preserve">flag plus the split UX /</w:t>
-            </w:r>
-            <w:r>
-              <w:t xml:space="preserve"> </w:t>
-            </w:r>
-            <w:r>
-              <w:rPr>
-                <w:rStyle w:val="VerbatimChar"/>
-              </w:rPr>
-              <w:t xml:space="preserve">*_Record</w:t>
-            </w:r>
-            <w:r>
-              <w:t xml:space="preserve"> </w:t>
-            </w:r>
-            <w:r>
-              <w:t xml:space="preserve">split branch / split tests move from</w:t>
+              <w:t xml:space="preserve">Three gap items moved in-scope as new Phase 9:</w:t>
+            </w:r>
+            <w:r>
+              <w:t xml:space="preserve"> </w:t>
+            </w:r>
+            <w:r>
+              <w:t xml:space="preserve">inspection recording (FDS-08-011..013), the Controlled Run Tag workflow (FDS-10-012 —</w:t>
+            </w:r>
+            <w:r>
+              <w:t xml:space="preserve"> </w:t>
+            </w:r>
+            <w:r>
+              <w:rPr>
+                <w:rStyle w:val="VerbatimChar"/>
+              </w:rPr>
+              <w:t xml:space="preserve">Lot.CrtActive</w:t>
+            </w:r>
+            <w:r>
+              <w:t xml:space="preserve"> </w:t>
+            </w:r>
+            <w:r>
+              <w:t xml:space="preserve">hook added to the Phase 1</w:t>
+            </w:r>
+            <w:r>
+              <w:t xml:space="preserve"> </w:t>
+            </w:r>
+            <w:r>
+              <w:rPr>
+                <w:rStyle w:val="VerbatimChar"/>
+              </w:rPr>
+              <w:t xml:space="preserve">Lot</w:t>
+            </w:r>
+            <w:r>
+              <w:t xml:space="preserve"> </w:t>
+            </w:r>
+            <w:r>
+              <w:t xml:space="preserve">CREATE per Data Model v1.9q), and the Global Trace Tool + LOT Genealogy Report (FDS-12). The legacy PD operational reports stay deferred to near/post-deployment (UJ-19). (2)</w:t>
             </w:r>
             <w:r>
               <w:t xml:space="preserve"> </w:t>
@@ -363,7 +348,7 @@
                 <w:b/>
                 <w:bCs/>
               </w:rPr>
-              <w:t xml:space="preserve">Phase 4 (Trim, migration</w:t>
+              <w:t xml:space="preserve">Arc 2 migrations re-baselined +1 to</w:t>
             </w:r>
             <w:r>
               <w:rPr>
@@ -378,114 +363,738 @@
                 <w:b/>
                 <w:bCs/>
               </w:rPr>
-              <w:t xml:space="preserve">0017</w:t>
+              <w:t xml:space="preserve">0020</w:t>
             </w:r>
             <w:r>
               <w:rPr>
                 <w:b/>
                 <w:bCs/>
               </w:rPr>
-              <w:t xml:space="preserve">)</w:t>
-            </w:r>
-            <w:r>
-              <w:t xml:space="preserve"> </w:t>
-            </w:r>
-            <w:r>
-              <w:t xml:space="preserve">to</w:t>
-            </w:r>
-            <w:r>
-              <w:t xml:space="preserve"> </w:t>
-            </w:r>
-            <w:r>
-              <w:rPr>
+              <w:t xml:space="preserve">-</w:t>
+            </w:r>
+            <w:r>
+              <w:rPr>
+                <w:rStyle w:val="VerbatimChar"/>
                 <w:b/>
                 <w:bCs/>
               </w:rPr>
-              <w:t xml:space="preserve">Phase 5 (Machining OUT, migration</w:t>
-            </w:r>
+              <w:t xml:space="preserve">0027</w:t>
+            </w:r>
+            <w:r>
+              <w:t xml:space="preserve"> </w:t>
+            </w:r>
+            <w:r>
+              <w:t xml:space="preserve">(Phase 9 =</w:t>
+            </w:r>
+            <w:r>
+              <w:t xml:space="preserve"> </w:t>
+            </w:r>
+            <w:r>
+              <w:rPr>
+                <w:rStyle w:val="VerbatimChar"/>
+              </w:rPr>
+              <w:t xml:space="preserve">0028</w:t>
+            </w:r>
+            <w:r>
+              <w:t xml:space="preserve">) because</w:t>
+            </w:r>
+            <w:r>
+              <w:t xml:space="preserve"> </w:t>
+            </w:r>
+            <w:r>
+              <w:rPr>
+                <w:rStyle w:val="VerbatimChar"/>
+              </w:rPr>
+              <w:t xml:space="preserve">0019_location_coupled_downstream_cell</w:t>
+            </w:r>
+            <w:r>
+              <w:t xml:space="preserve"> </w:t>
+            </w:r>
+            <w:r>
+              <w:t xml:space="preserve">landed on disk 2026-06-08; per-phase numbers are now framed as next-free-at-build-time with a drift note. (3) Data Model reference bumped to v1.9q.</w:t>
+            </w:r>
+          </w:p>
+        </w:tc>
+      </w:tr>
+      <w:tr>
+        <w:tc>
+          <w:tcPr>
+            <w:shd w:val="clear" w:color="auto" w:fill="F2F2F2"/>
+          </w:tcPr>
+          <w:tcPr/>
+          <w:p>
+            <w:pPr>
+              <w:pStyle w:val="Compact"/>
+            </w:pPr>
+            <w:r>
+              <w:t xml:space="preserve">1.2</w:t>
+            </w:r>
+          </w:p>
+        </w:tc>
+        <w:tc>
+          <w:tcPr>
+            <w:shd w:val="clear" w:color="auto" w:fill="F2F2F2"/>
+          </w:tcPr>
+          <w:tcPr/>
+          <w:p>
+            <w:pPr>
+              <w:pStyle w:val="Compact"/>
+            </w:pPr>
+            <w:r>
+              <w:t xml:space="preserve">2026-06-08</w:t>
+            </w:r>
+          </w:p>
+        </w:tc>
+        <w:tc>
+          <w:tcPr>
+            <w:shd w:val="clear" w:color="auto" w:fill="F2F2F2"/>
+          </w:tcPr>
+          <w:tcPr/>
+          <w:p>
+            <w:pPr>
+              <w:pStyle w:val="Compact"/>
+            </w:pPr>
+            <w:r>
+              <w:t xml:space="preserve">Blue Ridge Automation</w:t>
+            </w:r>
+          </w:p>
+        </w:tc>
+        <w:tc>
+          <w:tcPr>
+            <w:shd w:val="clear" w:color="auto" w:fill="F2F2F2"/>
+          </w:tcPr>
+          <w:tcPr/>
+          <w:p>
+            <w:pPr>
+              <w:pStyle w:val="Compact"/>
+            </w:pPr>
             <w:r>
               <w:rPr>
                 <w:b/>
                 <w:bCs/>
               </w:rPr>
-              <w:t xml:space="preserve"> </w:t>
-            </w:r>
-            <w:r>
-              <w:rPr>
-                <w:rStyle w:val="VerbatimChar"/>
+              <w:t xml:space="preserve">Validation-correction pass (build-readiness).</w:t>
+            </w:r>
+            <w:r>
+              <w:t xml:space="preserve"> </w:t>
+            </w:r>
+            <w:r>
+              <w:t xml:space="preserve">(1)</w:t>
+            </w:r>
+            <w:r>
+              <w:t xml:space="preserve"> </w:t>
+            </w:r>
+            <w:r>
+              <w:rPr>
                 <w:b/>
                 <w:bCs/>
               </w:rPr>
+              <w:t xml:space="preserve">Migration renumber</w:t>
+            </w:r>
+            <w:r>
+              <w:t xml:space="preserve"> </w:t>
+            </w:r>
+            <w:r>
+              <w:t xml:space="preserve">- Arc 1 shipped through</w:t>
+            </w:r>
+            <w:r>
+              <w:t xml:space="preserve"> </w:t>
+            </w:r>
+            <w:r>
+              <w:rPr>
+                <w:rStyle w:val="VerbatimChar"/>
+              </w:rPr>
               <w:t xml:space="preserve">0018</w:t>
             </w:r>
             <w:r>
-              <w:rPr>
+              <w:t xml:space="preserve">, so all Arc 2 migrations shift from</w:t>
+            </w:r>
+            <w:r>
+              <w:t xml:space="preserve"> </w:t>
+            </w:r>
+            <w:r>
+              <w:rPr>
+                <w:rStyle w:val="VerbatimChar"/>
+              </w:rPr>
+              <w:t xml:space="preserve">0014</w:t>
+            </w:r>
+            <w:r>
+              <w:t xml:space="preserve">-</w:t>
+            </w:r>
+            <w:r>
+              <w:rPr>
+                <w:rStyle w:val="VerbatimChar"/>
+              </w:rPr>
+              <w:t xml:space="preserve">0021</w:t>
+            </w:r>
+            <w:r>
+              <w:t xml:space="preserve"> </w:t>
+            </w:r>
+            <w:r>
+              <w:t xml:space="preserve">to</w:t>
+            </w:r>
+            <w:r>
+              <w:t xml:space="preserve"> </w:t>
+            </w:r>
+            <w:r>
+              <w:rPr>
+                <w:rStyle w:val="VerbatimChar"/>
                 <w:b/>
                 <w:bCs/>
               </w:rPr>
-              <w:t xml:space="preserve">)</w:t>
-            </w:r>
-            <w:r>
-              <w:t xml:space="preserve">. Phase 4 Trim OUT becomes move-whole-only (</w:t>
-            </w:r>
-            <w:r>
-              <w:rPr>
-                <w:rStyle w:val="VerbatimChar"/>
-              </w:rPr>
-              <w:t xml:space="preserve">TrimOut_Record</w:t>
-            </w:r>
-            <w:r>
-              <w:t xml:space="preserve"> </w:t>
-            </w:r>
-            <w:r>
-              <w:t xml:space="preserve">no longer splits); Phase 5 Machining OUT gains an</w:t>
-            </w:r>
-            <w:r>
-              <w:t xml:space="preserve"> </w:t>
+              <w:t xml:space="preserve">0020</w:t>
             </w:r>
             <w:r>
               <w:rPr>
                 <w:b/>
                 <w:bCs/>
               </w:rPr>
-              <w:t xml:space="preserve">operator-initiated split path on sublotting lines</w:t>
-            </w:r>
-            <w:r>
-              <w:t xml:space="preserve"> </w:t>
-            </w:r>
-            <w:r>
-              <w:t xml:space="preserve">(physical signature: a dedicated Machining OUT terminal) alongside the existing PLC auto-move on coupled lines. UJ-03 reframed (was closed backwards as</w:t>
-            </w:r>
-            <w:r>
-              <w:t xml:space="preserve"> </w:t>
-            </w:r>
-            <w:r>
-              <w:t xml:space="preserve">“Machining no longer splits”</w:t>
-            </w:r>
-            <w:r>
-              <w:t xml:space="preserve">). The Phase 4→5 ordering is unchanged but its nature shifts: a whole-LOT handoff into the Machining FIFO queue, not pre-split sub-LOTs. Mirrors</w:t>
-            </w:r>
-            <w:r>
-              <w:t xml:space="preserve"> </w:t>
-            </w:r>
-            <w:r>
-              <w:rPr>
+              <w:t xml:space="preserve">-</w:t>
+            </w:r>
+            <w:r>
+              <w:rPr>
+                <w:rStyle w:val="VerbatimChar"/>
                 <w:b/>
                 <w:bCs/>
               </w:rPr>
-              <w:t xml:space="preserve">FDS v1.3</w:t>
-            </w:r>
-            <w:r>
-              <w:t xml:space="preserve">.</w:t>
-            </w:r>
-            <w:r>
-              <w:t xml:space="preserve"> </w:t>
-            </w:r>
-            <w:r>
-              <w:rPr>
+              <w:t xml:space="preserve">0027</w:t>
+            </w:r>
+            <w:r>
+              <w:t xml:space="preserve"> </w:t>
+            </w:r>
+            <w:r>
+              <w:t xml:space="preserve">and test suites to</w:t>
+            </w:r>
+            <w:r>
+              <w:t xml:space="preserve"> </w:t>
+            </w:r>
+            <w:r>
+              <w:rPr>
+                <w:rStyle w:val="VerbatimChar"/>
                 <w:b/>
                 <w:bCs/>
               </w:rPr>
+              <w:t xml:space="preserve">0020</w:t>
+            </w:r>
+            <w:r>
+              <w:rPr>
+                <w:b/>
+                <w:bCs/>
+              </w:rPr>
+              <w:t xml:space="preserve">-</w:t>
+            </w:r>
+            <w:r>
+              <w:rPr>
+                <w:rStyle w:val="VerbatimChar"/>
+                <w:b/>
+                <w:bCs/>
+              </w:rPr>
+              <w:t xml:space="preserve">0027</w:t>
+            </w:r>
+            <w:r>
+              <w:t xml:space="preserve"> </w:t>
+            </w:r>
+            <w:r>
+              <w:t xml:space="preserve">(Arc 1 test suites end at</w:t>
+            </w:r>
+            <w:r>
+              <w:t xml:space="preserve"> </w:t>
+            </w:r>
+            <w:r>
+              <w:rPr>
+                <w:rStyle w:val="VerbatimChar"/>
+              </w:rPr>
+              <w:t xml:space="preserve">0019</w:t>
+            </w:r>
+            <w:r>
+              <w:t xml:space="preserve">). (2)</w:t>
+            </w:r>
+            <w:r>
+              <w:t xml:space="preserve"> </w:t>
+            </w:r>
+            <w:r>
+              <w:rPr>
+                <w:b/>
+                <w:bCs/>
+              </w:rPr>
+              <w:t xml:space="preserve">Phase 1 now CREATEs</w:t>
+            </w:r>
+            <w:r>
+              <w:rPr>
+                <w:b/>
+                <w:bCs/>
+              </w:rPr>
+              <w:t xml:space="preserve"> </w:t>
+            </w:r>
+            <w:r>
+              <w:rPr>
+                <w:rStyle w:val="VerbatimChar"/>
+                <w:b/>
+                <w:bCs/>
+              </w:rPr>
+              <w:t xml:space="preserve">Lots.Lot</w:t>
+            </w:r>
+            <w:r>
+              <w:rPr>
+                <w:b/>
+                <w:bCs/>
+              </w:rPr>
+              <w:t xml:space="preserve"> </w:t>
+            </w:r>
+            <w:r>
+              <w:rPr>
+                <w:b/>
+                <w:bCs/>
+              </w:rPr>
+              <w:t xml:space="preserve">(Tool/Cavity columns inline) +</w:t>
+            </w:r>
+            <w:r>
+              <w:rPr>
+                <w:b/>
+                <w:bCs/>
+              </w:rPr>
+              <w:t xml:space="preserve"> </w:t>
+            </w:r>
+            <w:r>
+              <w:rPr>
+                <w:rStyle w:val="VerbatimChar"/>
+                <w:b/>
+                <w:bCs/>
+              </w:rPr>
+              <w:t xml:space="preserve">LotStatusHistory</w:t>
+            </w:r>
+            <w:r>
+              <w:rPr>
+                <w:b/>
+                <w:bCs/>
+              </w:rPr>
+              <w:t xml:space="preserve"> </w:t>
+            </w:r>
+            <w:r>
+              <w:rPr>
+                <w:b/>
+                <w:bCs/>
+              </w:rPr>
+              <w:t xml:space="preserve">+</w:t>
+            </w:r>
+            <w:r>
+              <w:rPr>
+                <w:b/>
+                <w:bCs/>
+              </w:rPr>
+              <w:t xml:space="preserve"> </w:t>
+            </w:r>
+            <w:r>
+              <w:rPr>
+                <w:rStyle w:val="VerbatimChar"/>
+                <w:b/>
+                <w:bCs/>
+              </w:rPr>
+              <w:t xml:space="preserve">LotMovement</w:t>
+            </w:r>
+            <w:r>
+              <w:rPr>
+                <w:b/>
+                <w:bCs/>
+              </w:rPr>
+              <w:t xml:space="preserve">, and Phase 2 CREATEs</w:t>
+            </w:r>
+            <w:r>
+              <w:rPr>
+                <w:b/>
+                <w:bCs/>
+              </w:rPr>
+              <w:t xml:space="preserve"> </w:t>
+            </w:r>
+            <w:r>
+              <w:rPr>
+                <w:rStyle w:val="VerbatimChar"/>
+                <w:b/>
+                <w:bCs/>
+              </w:rPr>
+              <w:t xml:space="preserve">LotGenealogy</w:t>
+            </w:r>
+            <w:r>
+              <w:rPr>
+                <w:b/>
+                <w:bCs/>
+              </w:rPr>
+              <w:t xml:space="preserve"> </w:t>
+            </w:r>
+            <w:r>
+              <w:rPr>
+                <w:b/>
+                <w:bCs/>
+              </w:rPr>
+              <w:t xml:space="preserve">+</w:t>
+            </w:r>
+            <w:r>
+              <w:rPr>
+                <w:b/>
+                <w:bCs/>
+              </w:rPr>
+              <w:t xml:space="preserve"> </w:t>
+            </w:r>
+            <w:r>
+              <w:rPr>
+                <w:rStyle w:val="VerbatimChar"/>
+                <w:b/>
+                <w:bCs/>
+              </w:rPr>
+              <w:t xml:space="preserve">LotAttributeChange</w:t>
+            </w:r>
+            <w:r>
+              <w:rPr>
+                <w:b/>
+                <w:bCs/>
+              </w:rPr>
+              <w:t xml:space="preserve"> </w:t>
+            </w:r>
+            <w:r>
+              <w:rPr>
+                <w:b/>
+                <w:bCs/>
+              </w:rPr>
+              <w:t xml:space="preserve">+</w:t>
+            </w:r>
+            <w:r>
+              <w:rPr>
+                <w:b/>
+                <w:bCs/>
+              </w:rPr>
+              <w:t xml:space="preserve"> </w:t>
+            </w:r>
+            <w:r>
+              <w:rPr>
+                <w:rStyle w:val="VerbatimChar"/>
+                <w:b/>
+                <w:bCs/>
+              </w:rPr>
+              <w:t xml:space="preserve">LotLabel</w:t>
+            </w:r>
+            <w:r>
+              <w:t xml:space="preserve"> </w:t>
+            </w:r>
+            <w:r>
+              <w:t xml:space="preserve">- these core tables were never built by Arc 1 (which created only the Lots code tables); the prior plan wrongly ALTERed</w:t>
+            </w:r>
+            <w:r>
+              <w:t xml:space="preserve"> </w:t>
+            </w:r>
+            <w:r>
+              <w:rPr>
+                <w:rStyle w:val="VerbatimChar"/>
+              </w:rPr>
+              <w:t xml:space="preserve">Lot</w:t>
+            </w:r>
+            <w:r>
+              <w:t xml:space="preserve"> </w:t>
+            </w:r>
+            <w:r>
+              <w:t xml:space="preserve">as if it existed. (3) CREATE-ownership pinned:</w:t>
+            </w:r>
+            <w:r>
+              <w:t xml:space="preserve"> </w:t>
+            </w:r>
+            <w:r>
+              <w:rPr>
+                <w:rStyle w:val="VerbatimChar"/>
+              </w:rPr>
+              <w:t xml:space="preserve">HoldEvent</w:t>
+            </w:r>
+            <w:r>
+              <w:t xml:space="preserve">=Phase 7,</w:t>
+            </w:r>
+            <w:r>
+              <w:t xml:space="preserve"> </w:t>
+            </w:r>
+            <w:r>
+              <w:rPr>
+                <w:rStyle w:val="VerbatimChar"/>
+              </w:rPr>
+              <w:t xml:space="preserve">DowntimeEvent</w:t>
+            </w:r>
+            <w:r>
+              <w:t xml:space="preserve">=Phase 8,</w:t>
+            </w:r>
+            <w:r>
+              <w:t xml:space="preserve"> </w:t>
+            </w:r>
+            <w:r>
+              <w:rPr>
+                <w:rStyle w:val="VerbatimChar"/>
+              </w:rPr>
+              <w:t xml:space="preserve">ShippingLabel</w:t>
+            </w:r>
+            <w:r>
+              <w:t xml:space="preserve">=Phase 6 (incl. </w:t>
+            </w:r>
+            <w:r>
+              <w:rPr>
+                <w:rStyle w:val="VerbatimChar"/>
+              </w:rPr>
+              <w:t xml:space="preserve">ContainerSerial.HardwareInterlockBypassed</w:t>
+            </w:r>
+            <w:r>
+              <w:t xml:space="preserve">). (4) Phase 4 dependency corrected to {1,3} (not 2). (5) Stale v1.0a placeholder note removed; FDS/Data Model versions restamped to FDS v1.3 / DM v1.9o; Phase 7 gateway-script count corrected to six. (6) Three MVP gaps flagged for scope decision (inspection recording FDS-08-011..013; Controlled Run Tag FDS-10-012, also missing from schema; FDS-12 reporting + Global Trace Tool). Companion artifacts:</w:t>
+            </w:r>
+            <w:r>
+              <w:t xml:space="preserve"> </w:t>
+            </w:r>
+            <w:r>
+              <w:rPr>
+                <w:rStyle w:val="VerbatimChar"/>
+              </w:rPr>
+              <w:t xml:space="preserve">MPP_MES_PLANT_FLOOR_PLAN_VALIDATION.md</w:t>
+            </w:r>
+            <w:r>
+              <w:t xml:space="preserve"> </w:t>
+            </w:r>
+            <w:r>
+              <w:t xml:space="preserve">+</w:t>
+            </w:r>
+            <w:r>
+              <w:t xml:space="preserve"> </w:t>
+            </w:r>
+            <w:r>
+              <w:rPr>
+                <w:rStyle w:val="VerbatimChar"/>
+              </w:rPr>
+              <w:t xml:space="preserve">MPP_MES_TASK_LIST_PLANT_FLOOR.csv</w:t>
+            </w:r>
+            <w:r>
+              <w:t xml:space="preserve">.</w:t>
+            </w:r>
+          </w:p>
+        </w:tc>
+      </w:tr>
+      <w:tr>
+        <w:tc>
+          <w:tcPr/>
+          <w:p>
+            <w:pPr>
+              <w:pStyle w:val="Compact"/>
+            </w:pPr>
+            <w:r>
+              <w:t xml:space="preserve">1.1</w:t>
+            </w:r>
+          </w:p>
+        </w:tc>
+        <w:tc>
+          <w:tcPr/>
+          <w:p>
+            <w:pPr>
+              <w:pStyle w:val="Compact"/>
+            </w:pPr>
+            <w:r>
+              <w:t xml:space="preserve">2026-06-03</w:t>
+            </w:r>
+          </w:p>
+        </w:tc>
+        <w:tc>
+          <w:tcPr/>
+          <w:p>
+            <w:pPr>
+              <w:pStyle w:val="Compact"/>
+            </w:pPr>
+            <w:r>
+              <w:t xml:space="preserve">Blue Ridge Automation</w:t>
+            </w:r>
+          </w:p>
+        </w:tc>
+        <w:tc>
+          <w:tcPr/>
+          <w:p>
+            <w:pPr>
+              <w:pStyle w:val="Compact"/>
+            </w:pPr>
+            <w:r>
+              <w:rPr>
+                <w:b/>
+                <w:bCs/>
+              </w:rPr>
+              <w:t xml:space="preserve">Sub-LOT split relocated from Trim OUT to Machining OUT</w:t>
+            </w:r>
+            <w:r>
+              <w:t xml:space="preserve"> </w:t>
+            </w:r>
+            <w:r>
+              <w:t xml:space="preserve">(per MPP, confirmed 2026-06 — settled, not an open item). Reverses the v1.0 driver-(a) claim that the split sits at Trim OUT. Trim is now a</w:t>
+            </w:r>
+            <w:r>
+              <w:t xml:space="preserve"> </w:t>
+            </w:r>
+            <w:r>
+              <w:rPr>
+                <w:b/>
+                <w:bCs/>
+              </w:rPr>
+              <w:t xml:space="preserve">1:1 whole-LOT move tracked at Area resolution</w:t>
+            </w:r>
+            <w:r>
+              <w:t xml:space="preserve">; the</w:t>
+            </w:r>
+            <w:r>
+              <w:t xml:space="preserve"> </w:t>
+            </w:r>
+            <w:r>
+              <w:rPr>
+                <w:rStyle w:val="VerbatimChar"/>
+              </w:rPr>
+              <w:t xml:space="preserve">Parts.OperationTemplate.RequiresSubLotSplit</w:t>
+            </w:r>
+            <w:r>
+              <w:t xml:space="preserve"> </w:t>
+            </w:r>
+            <w:r>
+              <w:t xml:space="preserve">flag plus the split UX /</w:t>
+            </w:r>
+            <w:r>
+              <w:t xml:space="preserve"> </w:t>
+            </w:r>
+            <w:r>
+              <w:rPr>
+                <w:rStyle w:val="VerbatimChar"/>
+              </w:rPr>
+              <w:t xml:space="preserve">*_Record</w:t>
+            </w:r>
+            <w:r>
+              <w:t xml:space="preserve"> </w:t>
+            </w:r>
+            <w:r>
+              <w:t xml:space="preserve">split branch / split tests move from</w:t>
+            </w:r>
+            <w:r>
+              <w:t xml:space="preserve"> </w:t>
+            </w:r>
+            <w:r>
+              <w:rPr>
+                <w:b/>
+                <w:bCs/>
+              </w:rPr>
+              <w:t xml:space="preserve">Phase 4 (Trim, migration</w:t>
+            </w:r>
+            <w:r>
+              <w:rPr>
+                <w:b/>
+                <w:bCs/>
+              </w:rPr>
+              <w:t xml:space="preserve"> </w:t>
+            </w:r>
+            <w:r>
+              <w:rPr>
+                <w:rStyle w:val="VerbatimChar"/>
+                <w:b/>
+                <w:bCs/>
+              </w:rPr>
+              <w:t xml:space="preserve">0023</w:t>
+            </w:r>
+            <w:r>
+              <w:rPr>
+                <w:b/>
+                <w:bCs/>
+              </w:rPr>
+              <w:t xml:space="preserve">)</w:t>
+            </w:r>
+            <w:r>
+              <w:t xml:space="preserve"> </w:t>
+            </w:r>
+            <w:r>
+              <w:t xml:space="preserve">to</w:t>
+            </w:r>
+            <w:r>
+              <w:t xml:space="preserve"> </w:t>
+            </w:r>
+            <w:r>
+              <w:rPr>
+                <w:b/>
+                <w:bCs/>
+              </w:rPr>
+              <w:t xml:space="preserve">Phase 5 (Machining OUT, migration</w:t>
+            </w:r>
+            <w:r>
+              <w:rPr>
+                <w:b/>
+                <w:bCs/>
+              </w:rPr>
+              <w:t xml:space="preserve"> </w:t>
+            </w:r>
+            <w:r>
+              <w:rPr>
+                <w:rStyle w:val="VerbatimChar"/>
+                <w:b/>
+                <w:bCs/>
+              </w:rPr>
+              <w:t xml:space="preserve">0024</w:t>
+            </w:r>
+            <w:r>
+              <w:rPr>
+                <w:b/>
+                <w:bCs/>
+              </w:rPr>
+              <w:t xml:space="preserve">)</w:t>
+            </w:r>
+            <w:r>
+              <w:t xml:space="preserve">. Phase 4 Trim OUT becomes move-whole-only (</w:t>
+            </w:r>
+            <w:r>
+              <w:rPr>
+                <w:rStyle w:val="VerbatimChar"/>
+              </w:rPr>
+              <w:t xml:space="preserve">TrimOut_Record</w:t>
+            </w:r>
+            <w:r>
+              <w:t xml:space="preserve"> </w:t>
+            </w:r>
+            <w:r>
+              <w:t xml:space="preserve">no longer splits); Phase 5 Machining OUT gains an</w:t>
+            </w:r>
+            <w:r>
+              <w:t xml:space="preserve"> </w:t>
+            </w:r>
+            <w:r>
+              <w:rPr>
+                <w:b/>
+                <w:bCs/>
+              </w:rPr>
+              <w:t xml:space="preserve">operator-initiated split path on sublotting lines</w:t>
+            </w:r>
+            <w:r>
+              <w:t xml:space="preserve"> </w:t>
+            </w:r>
+            <w:r>
+              <w:t xml:space="preserve">(physical signature: a dedicated Machining OUT terminal) alongside the existing PLC auto-move on coupled lines. UJ-03 reframed (was closed backwards as</w:t>
+            </w:r>
+            <w:r>
+              <w:t xml:space="preserve"> </w:t>
+            </w:r>
+            <w:r>
+              <w:t xml:space="preserve">“Machining no longer splits”</w:t>
+            </w:r>
+            <w:r>
+              <w:t xml:space="preserve">). The Phase 4→5 ordering is unchanged but its nature shifts: a whole-LOT handoff into the Machining FIFO queue, not pre-split sub-LOTs. Mirrors</w:t>
+            </w:r>
+            <w:r>
+              <w:t xml:space="preserve"> </w:t>
+            </w:r>
+            <w:r>
+              <w:rPr>
+                <w:b/>
+                <w:bCs/>
+              </w:rPr>
+              <w:t xml:space="preserve">FDS v1.3</w:t>
+            </w:r>
+            <w:r>
+              <w:t xml:space="preserve">.</w:t>
+            </w:r>
+            <w:r>
+              <w:t xml:space="preserve"> </w:t>
+            </w:r>
+            <w:r>
+              <w:rPr>
+                <w:b/>
+                <w:bCs/>
+              </w:rPr>
               <w:t xml:space="preserve">No schema change</w:t>
             </w:r>
             <w:r>
@@ -546,7 +1155,7 @@
               <w:rPr>
                 <w:rStyle w:val="VerbatimChar"/>
               </w:rPr>
-              <w:t xml:space="preserve">0018</w:t>
+              <w:t xml:space="preserve">0023</w:t>
             </w:r>
             <w:r>
               <w:t xml:space="preserve"> </w:t>
@@ -561,7 +1170,7 @@
               <w:rPr>
                 <w:rStyle w:val="VerbatimChar"/>
               </w:rPr>
-              <w:t xml:space="preserve">0017</w:t>
+              <w:t xml:space="preserve">0022</w:t>
             </w:r>
             <w:r>
               <w:t xml:space="preserve">.</w:t>
@@ -850,7 +1459,7 @@
         <w:t xml:space="preserve"> </w:t>
       </w:r>
       <w:r>
-        <w:t xml:space="preserve">built the Configuration Tool: the engineering-facing surface where plant, items, routes, BOMs, quality specs, and reference vocabularies (shifts, downtime codes, defect codes) are authored. Arc 1 delivered across eight phases, with 13 versioned migrations (</w:t>
+        <w:t xml:space="preserve">built the Configuration Tool: the engineering-facing surface where plant, items, routes, BOMs, quality specs, and reference vocabularies (shifts, downtime codes, defect codes) are authored. Arc 1 delivered across eight phases, with 19 versioned migrations (</w:t>
       </w:r>
       <w:r>
         <w:rPr>
@@ -865,7 +1474,7 @@
         <w:rPr>
           <w:rStyle w:val="VerbatimChar"/>
         </w:rPr>
-        <w:t xml:space="preserve">0013</w:t>
+        <w:t xml:space="preserve">0019</w:t>
       </w:r>
       <w:r>
         <w:t xml:space="preserve">), ~216 repeatable stored procedures, and</w:t>
@@ -6843,7 +7452,8 @@
     <w:tbl>
       <w:tblPr>
         <w:tblStyle w:val="Table"/>
-        <w:tblW w:type="auto" w:w="0"/>
+        <w:tblW w:type="pct" w:w="5000"/>
+        <w:tblLayout w:type="fixed"/>
         <w:tblBorders>
           <w:top w:val="single" w:sz="4" w:space="0" w:color="808080"/>
           <w:left w:val="single" w:sz="4" w:space="0" w:color="808080"/>
@@ -7095,7 +7705,7 @@
               <w:pStyle w:val="Compact"/>
             </w:pPr>
             <w:r>
-              <w:t xml:space="preserve">1, 2, 3</w:t>
+              <w:t xml:space="preserve">1, 3</w:t>
             </w:r>
           </w:p>
         </w:tc>
@@ -7174,7 +7784,22 @@
               <w:pStyle w:val="Compact"/>
             </w:pPr>
             <w:r>
-              <w:t xml:space="preserve">1, 2, 3, 4, 5</w:t>
+              <w:t xml:space="preserve">1, 2, 3, 4, 5 (+ Phase 7</w:t>
+            </w:r>
+            <w:r>
+              <w:t xml:space="preserve"> </w:t>
+            </w:r>
+            <w:r>
+              <w:rPr>
+                <w:rStyle w:val="VerbatimChar"/>
+              </w:rPr>
+              <w:t xml:space="preserve">AimShipperIdPool</w:t>
+            </w:r>
+            <w:r>
+              <w:t xml:space="preserve"> </w:t>
+            </w:r>
+            <w:r>
+              <w:t xml:space="preserve">schema must ship first)</w:t>
             </w:r>
           </w:p>
         </w:tc>
@@ -10585,19 +11210,98 @@
         <w:t xml:space="preserve"> </w:t>
       </w:r>
       <w:r>
-        <w:t xml:space="preserve">versioned migrations 0001–0013 are landed (Arc 1 complete + 0013 OI-07/OI-12 corrections). Arc 2 Phase 1 lands at</w:t>
-      </w:r>
-      <w:r>
-        <w:t xml:space="preserve"> </w:t>
-      </w:r>
-      <w:r>
-        <w:rPr>
-          <w:rStyle w:val="VerbatimChar"/>
-        </w:rPr>
-        <w:t xml:space="preserve">0014_arc2_phase1_shop_floor_foundation.sql</w:t>
+        <w:t xml:space="preserve">versioned migrations 0001–0019 are landed (Arc 1 Config Tool through</w:t>
+      </w:r>
+      <w:r>
+        <w:t xml:space="preserve"> </w:t>
+      </w:r>
+      <w:r>
+        <w:rPr>
+          <w:rStyle w:val="VerbatimChar"/>
+        </w:rPr>
+        <w:t xml:space="preserve">0018</w:t>
+      </w:r>
+      <w:r>
+        <w:t xml:space="preserve">;</w:t>
+      </w:r>
+      <w:r>
+        <w:t xml:space="preserve"> </w:t>
+      </w:r>
+      <w:r>
+        <w:rPr>
+          <w:rStyle w:val="VerbatimChar"/>
+        </w:rPr>
+        <w:t xml:space="preserve">0019_location_coupled_downstream_cell</w:t>
+      </w:r>
+      <w:r>
+        <w:t xml:space="preserve"> </w:t>
+      </w:r>
+      <w:r>
+        <w:t xml:space="preserve">landed 2026-06-08). Arc 2 Phase 1 lands at</w:t>
+      </w:r>
+      <w:r>
+        <w:t xml:space="preserve"> </w:t>
+      </w:r>
+      <w:r>
+        <w:rPr>
+          <w:rStyle w:val="VerbatimChar"/>
+        </w:rPr>
+        <w:t xml:space="preserve">0020_arc2_phase1_shop_floor_foundation.sql</w:t>
+      </w:r>
+      <w:r>
+        <w:t xml:space="preserve">, Phases 2-8 increment to</w:t>
+      </w:r>
+      <w:r>
+        <w:t xml:space="preserve"> </w:t>
+      </w:r>
+      <w:r>
+        <w:rPr>
+          <w:rStyle w:val="VerbatimChar"/>
+        </w:rPr>
+        <w:t xml:space="preserve">0027</w:t>
+      </w:r>
+      <w:r>
+        <w:t xml:space="preserve">, gap-fill Phase 9 at</w:t>
+      </w:r>
+      <w:r>
+        <w:t xml:space="preserve"> </w:t>
+      </w:r>
+      <w:r>
+        <w:rPr>
+          <w:rStyle w:val="VerbatimChar"/>
+        </w:rPr>
+        <w:t xml:space="preserve">0028</w:t>
       </w:r>
       <w:r>
         <w:t xml:space="preserve">.</w:t>
+      </w:r>
+      <w:r>
+        <w:t xml:space="preserve"> </w:t>
+      </w:r>
+      <w:r>
+        <w:rPr>
+          <w:b/>
+          <w:bCs/>
+        </w:rPr>
+        <w:t xml:space="preserve">These are next-free-at-build-time numbers</w:t>
+      </w:r>
+      <w:r>
+        <w:t xml:space="preserve"> </w:t>
+      </w:r>
+      <w:r>
+        <w:t xml:space="preserve">— Arc 2 is OI-35-gated and pre-Arc-2 foundation migrations keep landing (e.g. </w:t>
+      </w:r>
+      <w:r>
+        <w:rPr>
+          <w:rStyle w:val="VerbatimChar"/>
+        </w:rPr>
+        <w:t xml:space="preserve">0019</w:t>
+      </w:r>
+      <w:r>
+        <w:t xml:space="preserve"> </w:t>
+      </w:r>
+      <w:r>
+        <w:t xml:space="preserve">just did), so treat the per-phase numbers as relative (+1 from the prior phase) and re-baseline against the actual migration high-water mark when the Arc 2 build commences.</w:t>
       </w:r>
     </w:p>
     <w:p>
@@ -10730,7 +11434,7 @@
           <w:b/>
           <w:bCs/>
         </w:rPr>
-        <w:t xml:space="preserve">sql/migrations/versioned/0014_arc2_phase1_shop_floor_foundation.sql</w:t>
+        <w:t xml:space="preserve">sql/migrations/versioned/0020_arc2_phase1_shop_floor_foundation.sql</w:t>
       </w:r>
       <w:r>
         <w:t xml:space="preserve"> </w:t>
@@ -10754,7 +11458,7 @@
         <w:rPr>
           <w:rStyle w:val="VerbatimChar"/>
         </w:rPr>
-        <w:t xml:space="preserve">0013</w:t>
+        <w:t xml:space="preserve">0019</w:t>
       </w:r>
       <w:r>
         <w:t xml:space="preserve">).</w:t>
@@ -10793,12 +11497,11 @@
           <w:b/>
           <w:bCs/>
         </w:rPr>
-        <w:t xml:space="preserve">New tables (Arc 2 — introduced here, per Data Model v1.9l):</w:t>
-      </w:r>
-    </w:p>
-    <w:p>
-      <w:pPr>
-        <w:pStyle w:val="Compact"/>
+        <w:t xml:space="preserve">New tables (Arc 2 — introduced here, per Data Model v1.9o):</w:t>
+      </w:r>
+    </w:p>
+    <w:p>
+      <w:pPr>
         <w:numPr>
           <w:ilvl w:val="0"/>
           <w:numId w:val="1010"/>
@@ -10814,7 +11517,7 @@
         <w:t xml:space="preserve"> </w:t>
       </w:r>
       <w:r>
-        <w:t xml:space="preserve">— CREATE with the v1.9l column contract:</w:t>
+        <w:t xml:space="preserve">— CREATE with the v1.9o column contract:</w:t>
       </w:r>
       <w:r>
         <w:t xml:space="preserve"> </w:t>
@@ -10988,7 +11691,6 @@
     </w:p>
     <w:p>
       <w:pPr>
-        <w:pStyle w:val="Compact"/>
         <w:numPr>
           <w:ilvl w:val="0"/>
           <w:numId w:val="1010"/>
@@ -11021,7 +11723,6 @@
     </w:p>
     <w:p>
       <w:pPr>
-        <w:pStyle w:val="Compact"/>
         <w:numPr>
           <w:ilvl w:val="0"/>
           <w:numId w:val="1010"/>
@@ -11037,7 +11738,7 @@
         <w:t xml:space="preserve"> </w:t>
       </w:r>
       <w:r>
-        <w:t xml:space="preserve">— CREATE per Data Model v1.9l checkpoint shape:</w:t>
+        <w:t xml:space="preserve">— CREATE per Data Model v1.9o checkpoint shape:</w:t>
       </w:r>
       <w:r>
         <w:t xml:space="preserve"> </w:t>
@@ -11362,7 +12063,6 @@
     </w:p>
     <w:p>
       <w:pPr>
-        <w:pStyle w:val="Compact"/>
         <w:numPr>
           <w:ilvl w:val="0"/>
           <w:numId w:val="1010"/>
@@ -11398,7 +12098,6 @@
     </w:p>
     <w:p>
       <w:pPr>
-        <w:pStyle w:val="Compact"/>
         <w:numPr>
           <w:ilvl w:val="0"/>
           <w:numId w:val="1010"/>
@@ -11431,7 +12130,6 @@
     </w:p>
     <w:p>
       <w:pPr>
-        <w:pStyle w:val="Compact"/>
         <w:numPr>
           <w:ilvl w:val="0"/>
           <w:numId w:val="1010"/>
@@ -11464,7 +12162,6 @@
     </w:p>
     <w:p>
       <w:pPr>
-        <w:pStyle w:val="Compact"/>
         <w:numPr>
           <w:ilvl w:val="0"/>
           <w:numId w:val="1010"/>
@@ -11617,6 +12314,385 @@
       </w:r>
       <w:r>
         <w:t xml:space="preserve">.</w:t>
+      </w:r>
+    </w:p>
+    <w:p>
+      <w:pPr>
+        <w:numPr>
+          <w:ilvl w:val="0"/>
+          <w:numId w:val="1010"/>
+        </w:numPr>
+      </w:pPr>
+      <w:r>
+        <w:rPr>
+          <w:rStyle w:val="VerbatimChar"/>
+        </w:rPr>
+        <w:t xml:space="preserve">Lots.Lot</w:t>
+      </w:r>
+      <w:r>
+        <w:t xml:space="preserve"> </w:t>
+      </w:r>
+      <w:r>
+        <w:t xml:space="preserve">–</w:t>
+      </w:r>
+      <w:r>
+        <w:t xml:space="preserve"> </w:t>
+      </w:r>
+      <w:r>
+        <w:rPr>
+          <w:b/>
+          <w:bCs/>
+        </w:rPr>
+        <w:t xml:space="preserve">CREATE (not ALTER).</w:t>
+      </w:r>
+      <w:r>
+        <w:t xml:space="preserve"> </w:t>
+      </w:r>
+      <w:r>
+        <w:t xml:space="preserve">Arc 1 built only the Lots</w:t>
+      </w:r>
+      <w:r>
+        <w:t xml:space="preserve"> </w:t>
+      </w:r>
+      <w:r>
+        <w:rPr>
+          <w:i/>
+          <w:iCs/>
+        </w:rPr>
+        <w:t xml:space="preserve">code</w:t>
+      </w:r>
+      <w:r>
+        <w:t xml:space="preserve"> </w:t>
+      </w:r>
+      <w:r>
+        <w:t xml:space="preserve">tables (</w:t>
+      </w:r>
+      <w:r>
+        <w:rPr>
+          <w:rStyle w:val="VerbatimChar"/>
+        </w:rPr>
+        <w:t xml:space="preserve">0004</w:t>
+      </w:r>
+      <w:r>
+        <w:t xml:space="preserve">);</w:t>
+      </w:r>
+      <w:r>
+        <w:t xml:space="preserve"> </w:t>
+      </w:r>
+      <w:r>
+        <w:rPr>
+          <w:rStyle w:val="VerbatimChar"/>
+        </w:rPr>
+        <w:t xml:space="preserve">Lot</w:t>
+      </w:r>
+      <w:r>
+        <w:t xml:space="preserve"> </w:t>
+      </w:r>
+      <w:r>
+        <w:t xml:space="preserve">itself is new here. Full v1.9q column contract per Data Model section 3,</w:t>
+      </w:r>
+      <w:r>
+        <w:t xml:space="preserve"> </w:t>
+      </w:r>
+      <w:r>
+        <w:rPr>
+          <w:b/>
+          <w:bCs/>
+        </w:rPr>
+        <w:t xml:space="preserve">with</w:t>
+      </w:r>
+      <w:r>
+        <w:rPr>
+          <w:b/>
+          <w:bCs/>
+        </w:rPr>
+        <w:t xml:space="preserve"> </w:t>
+      </w:r>
+      <w:r>
+        <w:rPr>
+          <w:rStyle w:val="VerbatimChar"/>
+          <w:b/>
+          <w:bCs/>
+        </w:rPr>
+        <w:t xml:space="preserve">ToolId BIGINT NULL FK -&gt; Tools.Tool(Id)</w:t>
+      </w:r>
+      <w:r>
+        <w:rPr>
+          <w:b/>
+          <w:bCs/>
+        </w:rPr>
+        <w:t xml:space="preserve"> </w:t>
+      </w:r>
+      <w:r>
+        <w:rPr>
+          <w:b/>
+          <w:bCs/>
+        </w:rPr>
+        <w:t xml:space="preserve">and</w:t>
+      </w:r>
+      <w:r>
+        <w:rPr>
+          <w:b/>
+          <w:bCs/>
+        </w:rPr>
+        <w:t xml:space="preserve"> </w:t>
+      </w:r>
+      <w:r>
+        <w:rPr>
+          <w:rStyle w:val="VerbatimChar"/>
+          <w:b/>
+          <w:bCs/>
+        </w:rPr>
+        <w:t xml:space="preserve">ToolCavityId BIGINT NULL FK -&gt; Tools.ToolCavity(Id)</w:t>
+      </w:r>
+      <w:r>
+        <w:rPr>
+          <w:b/>
+          <w:bCs/>
+        </w:rPr>
+        <w:t xml:space="preserve"> </w:t>
+      </w:r>
+      <w:r>
+        <w:rPr>
+          <w:b/>
+          <w:bCs/>
+        </w:rPr>
+        <w:t xml:space="preserve">columns built in</w:t>
+      </w:r>
+      <w:r>
+        <w:t xml:space="preserve"> </w:t>
+      </w:r>
+      <w:r>
+        <w:t xml:space="preserve">(required at</w:t>
+      </w:r>
+      <w:r>
+        <w:t xml:space="preserve"> </w:t>
+      </w:r>
+      <w:r>
+        <w:rPr>
+          <w:rStyle w:val="VerbatimChar"/>
+        </w:rPr>
+        <w:t xml:space="preserve">Lot_Create</w:t>
+      </w:r>
+      <w:r>
+        <w:t xml:space="preserve"> </w:t>
+      </w:r>
+      <w:r>
+        <w:t xml:space="preserve">for die-cast-origin LOTs; NULL elsewhere; NULL after</w:t>
+      </w:r>
+      <w:r>
+        <w:t xml:space="preserve"> </w:t>
+      </w:r>
+      <w:r>
+        <w:rPr>
+          <w:rStyle w:val="VerbatimChar"/>
+        </w:rPr>
+        <w:t xml:space="preserve">Lot_Merge</w:t>
+      </w:r>
+      <w:r>
+        <w:t xml:space="preserve">), the</w:t>
+      </w:r>
+      <w:r>
+        <w:t xml:space="preserve"> </w:t>
+      </w:r>
+      <w:r>
+        <w:rPr>
+          <w:rStyle w:val="VerbatimChar"/>
+          <w:b/>
+          <w:bCs/>
+        </w:rPr>
+        <w:t xml:space="preserve">CrtActive BIT NOT NULL DEFAULT 0</w:t>
+      </w:r>
+      <w:r>
+        <w:t xml:space="preserve"> </w:t>
+      </w:r>
+      <w:r>
+        <w:t xml:space="preserve">Controlled Run Tag flag (FDS-10-012 — the CRT workflow itself builds in Phase 9), plus the OI-35 B5 materialized</w:t>
+      </w:r>
+      <w:r>
+        <w:t xml:space="preserve"> </w:t>
+      </w:r>
+      <w:r>
+        <w:rPr>
+          <w:rStyle w:val="VerbatimChar"/>
+        </w:rPr>
+        <w:t xml:space="preserve">TotalInProcess</w:t>
+      </w:r>
+      <w:r>
+        <w:t xml:space="preserve"> </w:t>
+      </w:r>
+      <w:r>
+        <w:t xml:space="preserve">/</w:t>
+      </w:r>
+      <w:r>
+        <w:t xml:space="preserve"> </w:t>
+      </w:r>
+      <w:r>
+        <w:rPr>
+          <w:rStyle w:val="VerbatimChar"/>
+        </w:rPr>
+        <w:t xml:space="preserve">InventoryAvailable</w:t>
+      </w:r>
+      <w:r>
+        <w:t xml:space="preserve"> </w:t>
+      </w:r>
+      <w:r>
+        <w:t xml:space="preserve">columns (below).</w:t>
+      </w:r>
+    </w:p>
+    <w:p>
+      <w:pPr>
+        <w:numPr>
+          <w:ilvl w:val="0"/>
+          <w:numId w:val="1010"/>
+        </w:numPr>
+      </w:pPr>
+      <w:r>
+        <w:rPr>
+          <w:rStyle w:val="VerbatimChar"/>
+        </w:rPr>
+        <w:t xml:space="preserve">Lots.LotStatusHistory</w:t>
+      </w:r>
+      <w:r>
+        <w:t xml:space="preserve"> </w:t>
+      </w:r>
+      <w:r>
+        <w:t xml:space="preserve">– CREATE per Data Model section 3 (append-only; written by</w:t>
+      </w:r>
+      <w:r>
+        <w:t xml:space="preserve"> </w:t>
+      </w:r>
+      <w:r>
+        <w:rPr>
+          <w:rStyle w:val="VerbatimChar"/>
+        </w:rPr>
+        <w:t xml:space="preserve">Lot_UpdateStatus</w:t>
+      </w:r>
+      <w:r>
+        <w:t xml:space="preserve">). Never built by Arc 1.</w:t>
+      </w:r>
+    </w:p>
+    <w:p>
+      <w:pPr>
+        <w:numPr>
+          <w:ilvl w:val="0"/>
+          <w:numId w:val="1010"/>
+        </w:numPr>
+      </w:pPr>
+      <w:r>
+        <w:rPr>
+          <w:rStyle w:val="VerbatimChar"/>
+        </w:rPr>
+        <w:t xml:space="preserve">Lots.LotMovement</w:t>
+      </w:r>
+      <w:r>
+        <w:t xml:space="preserve"> </w:t>
+      </w:r>
+      <w:r>
+        <w:t xml:space="preserve">– CREATE per Data Model section 3 (append-only; written by</w:t>
+      </w:r>
+      <w:r>
+        <w:t xml:space="preserve"> </w:t>
+      </w:r>
+      <w:r>
+        <w:rPr>
+          <w:rStyle w:val="VerbatimChar"/>
+        </w:rPr>
+        <w:t xml:space="preserve">Lot_MoveTo</w:t>
+      </w:r>
+      <w:r>
+        <w:t xml:space="preserve">). Never built by Arc 1.</w:t>
+      </w:r>
+    </w:p>
+    <w:p>
+      <w:pPr>
+        <w:numPr>
+          <w:ilvl w:val="0"/>
+          <w:numId w:val="1010"/>
+        </w:numPr>
+      </w:pPr>
+      <w:r>
+        <w:rPr>
+          <w:rStyle w:val="VerbatimChar"/>
+        </w:rPr>
+        <w:t xml:space="preserve">Parts.v_EffectiveItemLocation</w:t>
+      </w:r>
+      <w:r>
+        <w:t xml:space="preserve"> </w:t>
+      </w:r>
+      <w:r>
+        <w:t xml:space="preserve">– CREATE VIEW (direct + BOM-derived eligibility; read by scan-in eligibility checks). Arc 2 Phase 1 per Data Model.</w:t>
+      </w:r>
+      <w:r>
+        <w:t xml:space="preserve"> </w:t>
+      </w:r>
+      <w:r>
+        <w:t xml:space="preserve">&gt;</w:t>
+      </w:r>
+      <w:r>
+        <w:t xml:space="preserve"> </w:t>
+      </w:r>
+      <w:r>
+        <w:rPr>
+          <w:b/>
+          <w:bCs/>
+        </w:rPr>
+        <w:t xml:space="preserve">Note (B-2):</w:t>
+      </w:r>
+      <w:r>
+        <w:t xml:space="preserve"> </w:t>
+      </w:r>
+      <w:r>
+        <w:rPr>
+          <w:rStyle w:val="VerbatimChar"/>
+        </w:rPr>
+        <w:t xml:space="preserve">LotGenealogy</w:t>
+      </w:r>
+      <w:r>
+        <w:t xml:space="preserve">,</w:t>
+      </w:r>
+      <w:r>
+        <w:t xml:space="preserve"> </w:t>
+      </w:r>
+      <w:r>
+        <w:rPr>
+          <w:rStyle w:val="VerbatimChar"/>
+        </w:rPr>
+        <w:t xml:space="preserve">LotAttributeChange</w:t>
+      </w:r>
+      <w:r>
+        <w:t xml:space="preserve">, and</w:t>
+      </w:r>
+      <w:r>
+        <w:t xml:space="preserve"> </w:t>
+      </w:r>
+      <w:r>
+        <w:rPr>
+          <w:rStyle w:val="VerbatimChar"/>
+        </w:rPr>
+        <w:t xml:space="preserve">LotLabel</w:t>
+      </w:r>
+      <w:r>
+        <w:t xml:space="preserve"> </w:t>
+      </w:r>
+      <w:r>
+        <w:t xml:space="preserve">are likewise net-new Arc-2 tables, CREATEd in</w:t>
+      </w:r>
+      <w:r>
+        <w:t xml:space="preserve"> </w:t>
+      </w:r>
+      <w:r>
+        <w:rPr>
+          <w:b/>
+          <w:bCs/>
+        </w:rPr>
+        <w:t xml:space="preserve">Phase 2</w:t>
+      </w:r>
+      <w:r>
+        <w:t xml:space="preserve"> </w:t>
+      </w:r>
+      <w:r>
+        <w:t xml:space="preserve">(their first writers live there).</w:t>
       </w:r>
     </w:p>
     <w:p>
@@ -11782,10 +12858,52 @@
         <w:t xml:space="preserve">Audit.FailureLog</w:t>
       </w:r>
       <w:r>
-        <w:t xml:space="preserve">,</w:t>
-      </w:r>
-      <w:r>
-        <w:t xml:space="preserve"> </w:t>
+        <w:t xml:space="preserve">. Range partitioned on</w:t>
+      </w:r>
+      <w:r>
+        <w:t xml:space="preserve"> </w:t>
+      </w:r>
+      <w:r>
+        <w:rPr>
+          <w:rStyle w:val="VerbatimChar"/>
+        </w:rPr>
+        <w:t xml:space="preserve">CreatedAt</w:t>
+      </w:r>
+      <w:r>
+        <w:t xml:space="preserve"> </w:t>
+      </w:r>
+      <w:r>
+        <w:t xml:space="preserve">/</w:t>
+      </w:r>
+      <w:r>
+        <w:t xml:space="preserve"> </w:t>
+      </w:r>
+      <w:r>
+        <w:rPr>
+          <w:rStyle w:val="VerbatimChar"/>
+        </w:rPr>
+        <w:t xml:space="preserve">EventAt</w:t>
+      </w:r>
+      <w:r>
+        <w:t xml:space="preserve"> </w:t>
+      </w:r>
+      <w:r>
+        <w:t xml:space="preserve">/</w:t>
+      </w:r>
+      <w:r>
+        <w:t xml:space="preserve"> </w:t>
+      </w:r>
+      <w:r>
+        <w:rPr>
+          <w:rStyle w:val="VerbatimChar"/>
+        </w:rPr>
+        <w:t xml:space="preserve">LoggedAt</w:t>
+      </w:r>
+      <w:r>
+        <w:t xml:space="preserve"> </w:t>
+      </w:r>
+      <w:r>
+        <w:t xml:space="preserve">per table. Monthly boundaries; sliding-window maintenance lands in a Phase 1 Gateway timer. (</w:t>
       </w:r>
       <w:r>
         <w:rPr>
@@ -11794,7 +12912,10 @@
         <w:t xml:space="preserve">Oee.DowntimeEvent</w:t>
       </w:r>
       <w:r>
-        <w:t xml:space="preserve">,</w:t>
+        <w:t xml:space="preserve"> </w:t>
+      </w:r>
+      <w:r>
+        <w:t xml:space="preserve">and</w:t>
       </w:r>
       <w:r>
         <w:t xml:space="preserve"> </w:t>
@@ -11806,52 +12927,10 @@
         <w:t xml:space="preserve">Quality.HoldEvent</w:t>
       </w:r>
       <w:r>
-        <w:t xml:space="preserve">. Range partitioned on</w:t>
-      </w:r>
-      <w:r>
-        <w:t xml:space="preserve"> </w:t>
-      </w:r>
-      <w:r>
-        <w:rPr>
-          <w:rStyle w:val="VerbatimChar"/>
-        </w:rPr>
-        <w:t xml:space="preserve">CreatedAt</w:t>
-      </w:r>
-      <w:r>
-        <w:t xml:space="preserve"> </w:t>
-      </w:r>
-      <w:r>
-        <w:t xml:space="preserve">/</w:t>
-      </w:r>
-      <w:r>
-        <w:t xml:space="preserve"> </w:t>
-      </w:r>
-      <w:r>
-        <w:rPr>
-          <w:rStyle w:val="VerbatimChar"/>
-        </w:rPr>
-        <w:t xml:space="preserve">EventAt</w:t>
-      </w:r>
-      <w:r>
-        <w:t xml:space="preserve"> </w:t>
-      </w:r>
-      <w:r>
-        <w:t xml:space="preserve">/</w:t>
-      </w:r>
-      <w:r>
-        <w:t xml:space="preserve"> </w:t>
-      </w:r>
-      <w:r>
-        <w:rPr>
-          <w:rStyle w:val="VerbatimChar"/>
-        </w:rPr>
-        <w:t xml:space="preserve">LoggedAt</w:t>
-      </w:r>
-      <w:r>
-        <w:t xml:space="preserve"> </w:t>
-      </w:r>
-      <w:r>
-        <w:t xml:space="preserve">per table. Monthly boundaries; sliding-window maintenance lands in a Phase 1 Gateway timer.</w:t>
+        <w:t xml:space="preserve"> </w:t>
+      </w:r>
+      <w:r>
+        <w:t xml:space="preserve">are CREATEd in their owning phases – Phase 8 and Phase 7 – and partitioned there with the same monthly scheme.)</w:t>
       </w:r>
     </w:p>
     <w:p>
@@ -12216,6 +13295,22 @@
       </w:pPr>
       <w:r>
         <w:rPr>
+          <w:b/>
+          <w:bCs/>
+        </w:rPr>
+        <w:t xml:space="preserve">None.</w:t>
+      </w:r>
+      <w:r>
+        <w:t xml:space="preserve"> </w:t>
+      </w:r>
+      <w:r>
+        <w:t xml:space="preserve">The</w:t>
+      </w:r>
+      <w:r>
+        <w:t xml:space="preserve"> </w:t>
+      </w:r>
+      <w:r>
+        <w:rPr>
           <w:rStyle w:val="VerbatimChar"/>
         </w:rPr>
         <w:t xml:space="preserve">Lots.Lot</w:t>
@@ -12224,61 +13319,102 @@
         <w:t xml:space="preserve"> </w:t>
       </w:r>
       <w:r>
-        <w:t xml:space="preserve">ADD</w:t>
-      </w:r>
-      <w:r>
-        <w:t xml:space="preserve"> </w:t>
-      </w:r>
-      <w:r>
-        <w:rPr>
-          <w:rStyle w:val="VerbatimChar"/>
-        </w:rPr>
-        <w:t xml:space="preserve">ToolId BIGINT NULL FK → Tools.Tool(Id)</w:t>
-      </w:r>
-      <w:r>
-        <w:t xml:space="preserve"> </w:t>
-      </w:r>
-      <w:r>
-        <w:t xml:space="preserve">and</w:t>
-      </w:r>
-      <w:r>
-        <w:t xml:space="preserve"> </w:t>
-      </w:r>
-      <w:r>
-        <w:rPr>
-          <w:rStyle w:val="VerbatimChar"/>
-        </w:rPr>
-        <w:t xml:space="preserve">ToolCavityId BIGINT NULL FK → Tools.ToolCavity(Id)</w:t>
-      </w:r>
-      <w:r>
-        <w:t xml:space="preserve">. Required at</w:t>
-      </w:r>
-      <w:r>
-        <w:t xml:space="preserve"> </w:t>
-      </w:r>
-      <w:r>
-        <w:rPr>
-          <w:rStyle w:val="VerbatimChar"/>
-        </w:rPr>
-        <w:t xml:space="preserve">Lot_Create</w:t>
-      </w:r>
-      <w:r>
-        <w:t xml:space="preserve"> </w:t>
-      </w:r>
-      <w:r>
-        <w:t xml:space="preserve">for die-cast-origin LOTs; NULL elsewhere; NULL after</w:t>
-      </w:r>
-      <w:r>
-        <w:t xml:space="preserve"> </w:t>
-      </w:r>
-      <w:r>
-        <w:rPr>
-          <w:rStyle w:val="VerbatimChar"/>
-        </w:rPr>
-        <w:t xml:space="preserve">Lot_Merge</w:t>
-      </w:r>
-      <w:r>
-        <w:t xml:space="preserve">.</w:t>
+        <w:rPr>
+          <w:rStyle w:val="VerbatimChar"/>
+        </w:rPr>
+        <w:t xml:space="preserve">ToolId</w:t>
+      </w:r>
+      <w:r>
+        <w:t xml:space="preserve"> </w:t>
+      </w:r>
+      <w:r>
+        <w:t xml:space="preserve">/</w:t>
+      </w:r>
+      <w:r>
+        <w:t xml:space="preserve"> </w:t>
+      </w:r>
+      <w:r>
+        <w:rPr>
+          <w:rStyle w:val="VerbatimChar"/>
+        </w:rPr>
+        <w:t xml:space="preserve">ToolCavityId</w:t>
+      </w:r>
+      <w:r>
+        <w:t xml:space="preserve"> </w:t>
+      </w:r>
+      <w:r>
+        <w:t xml:space="preserve">columns are part of the</w:t>
+      </w:r>
+      <w:r>
+        <w:t xml:space="preserve"> </w:t>
+      </w:r>
+      <w:r>
+        <w:rPr>
+          <w:rStyle w:val="VerbatimChar"/>
+        </w:rPr>
+        <w:t xml:space="preserve">Lot</w:t>
+      </w:r>
+      <w:r>
+        <w:t xml:space="preserve"> </w:t>
+      </w:r>
+      <w:r>
+        <w:rPr>
+          <w:b/>
+          <w:bCs/>
+        </w:rPr>
+        <w:t xml:space="preserve">CREATE</w:t>
+      </w:r>
+      <w:r>
+        <w:t xml:space="preserve"> </w:t>
+      </w:r>
+      <w:r>
+        <w:t xml:space="preserve">above. (The prior plan ALTERed</w:t>
+      </w:r>
+      <w:r>
+        <w:t xml:space="preserve"> </w:t>
+      </w:r>
+      <w:r>
+        <w:rPr>
+          <w:rStyle w:val="VerbatimChar"/>
+        </w:rPr>
+        <w:t xml:space="preserve">Lots.Lot</w:t>
+      </w:r>
+      <w:r>
+        <w:t xml:space="preserve"> </w:t>
+      </w:r>
+      <w:r>
+        <w:t xml:space="preserve">as if Arc 1 had built it; Arc 1 created only the Lots</w:t>
+      </w:r>
+      <w:r>
+        <w:t xml:space="preserve"> </w:t>
+      </w:r>
+      <w:r>
+        <w:rPr>
+          <w:i/>
+          <w:iCs/>
+        </w:rPr>
+        <w:t xml:space="preserve">code</w:t>
+      </w:r>
+      <w:r>
+        <w:t xml:space="preserve"> </w:t>
+      </w:r>
+      <w:r>
+        <w:t xml:space="preserve">tables, so</w:t>
+      </w:r>
+      <w:r>
+        <w:t xml:space="preserve"> </w:t>
+      </w:r>
+      <w:r>
+        <w:rPr>
+          <w:rStyle w:val="VerbatimChar"/>
+        </w:rPr>
+        <w:t xml:space="preserve">Lot</w:t>
+      </w:r>
+      <w:r>
+        <w:t xml:space="preserve"> </w:t>
+      </w:r>
+      <w:r>
+        <w:t xml:space="preserve">is new in this migration.)</w:t>
       </w:r>
     </w:p>
     <w:p>
@@ -15179,7 +16315,7 @@
         <w:t xml:space="preserve"> </w:t>
       </w:r>
       <w:r>
-        <w:t xml:space="preserve">flow (narrated from Phase 3’s perspective — the proc is delivered here). Aligned to Data Model v1.9l + FDS-05-034 / FDS-05-035:</w:t>
+        <w:t xml:space="preserve">flow (narrated from Phase 3’s perspective — the proc is delivered here). Aligned to Data Model v1.9o + FDS-05-034 / FDS-05-035:</w:t>
       </w:r>
     </w:p>
     <w:p>
@@ -21239,7 +22375,7 @@
         <w:rPr>
           <w:rStyle w:val="VerbatimChar"/>
         </w:rPr>
-        <w:t xml:space="preserve">sql/tests/0014_PlantFloor_Foundation/</w:t>
+        <w:t xml:space="preserve">sql/tests/0020_PlantFloor_Foundation/</w:t>
       </w:r>
       <w:r>
         <w:t xml:space="preserve"> </w:t>
@@ -22085,7 +23221,7 @@
         <w:pStyle w:val="BodyText"/>
       </w:pPr>
       <w:r>
-        <w:t xml:space="preserve">Target: 80–105 passing tests in suite 0014 (up from v0.x target — adds closure-table tests + Tool/Cavity validation + IdentifierSequence + AD elevation).</w:t>
+        <w:t xml:space="preserve">Target: 80–105 passing tests in suite 0020 (up from v0.x target — adds closure-table tests + Tool/Cavity validation + IdentifierSequence + AD elevation).</w:t>
       </w:r>
     </w:p>
     <w:bookmarkEnd w:id="65"/>
@@ -22116,7 +23252,7 @@
         <w:rPr>
           <w:rStyle w:val="VerbatimChar"/>
         </w:rPr>
-        <w:t xml:space="preserve">0014_arc2_phase1_shop_floor_foundation.sql</w:t>
+        <w:t xml:space="preserve">0020_arc2_phase1_shop_floor_foundation.sql</w:t>
       </w:r>
       <w:r>
         <w:t xml:space="preserve"> </w:t>
@@ -22285,7 +23421,7 @@
         <w:rPr>
           <w:rStyle w:val="VerbatimChar"/>
         </w:rPr>
-        <w:t xml:space="preserve">sql/tests/0014_PlantFloor_Foundation/</w:t>
+        <w:t xml:space="preserve">sql/tests/0020_PlantFloor_Foundation/</w:t>
       </w:r>
       <w:r>
         <w:t xml:space="preserve"> </w:t>
@@ -22745,7 +23881,82 @@
         <w:t xml:space="preserve"> </w:t>
       </w:r>
       <w:r>
-        <w:t xml:space="preserve">Phase 1 (foundation). Most Lots schema tables already exist from Phase 1 migration.</w:t>
+        <w:t xml:space="preserve">Phase 1 (foundation). Phase 1 created</w:t>
+      </w:r>
+      <w:r>
+        <w:t xml:space="preserve"> </w:t>
+      </w:r>
+      <w:r>
+        <w:rPr>
+          <w:rStyle w:val="VerbatimChar"/>
+        </w:rPr>
+        <w:t xml:space="preserve">Lots.Lot</w:t>
+      </w:r>
+      <w:r>
+        <w:t xml:space="preserve"> </w:t>
+      </w:r>
+      <w:r>
+        <w:t xml:space="preserve">+</w:t>
+      </w:r>
+      <w:r>
+        <w:t xml:space="preserve"> </w:t>
+      </w:r>
+      <w:r>
+        <w:rPr>
+          <w:rStyle w:val="VerbatimChar"/>
+        </w:rPr>
+        <w:t xml:space="preserve">LotStatusHistory</w:t>
+      </w:r>
+      <w:r>
+        <w:t xml:space="preserve"> </w:t>
+      </w:r>
+      <w:r>
+        <w:t xml:space="preserve">+</w:t>
+      </w:r>
+      <w:r>
+        <w:t xml:space="preserve"> </w:t>
+      </w:r>
+      <w:r>
+        <w:rPr>
+          <w:rStyle w:val="VerbatimChar"/>
+        </w:rPr>
+        <w:t xml:space="preserve">LotMovement</w:t>
+      </w:r>
+      <w:r>
+        <w:t xml:space="preserve">; Phase 2 CREATEs the remaining LOT-lifecycle tables (</w:t>
+      </w:r>
+      <w:r>
+        <w:rPr>
+          <w:rStyle w:val="VerbatimChar"/>
+        </w:rPr>
+        <w:t xml:space="preserve">LotGenealogy</w:t>
+      </w:r>
+      <w:r>
+        <w:t xml:space="preserve">,</w:t>
+      </w:r>
+      <w:r>
+        <w:t xml:space="preserve"> </w:t>
+      </w:r>
+      <w:r>
+        <w:rPr>
+          <w:rStyle w:val="VerbatimChar"/>
+        </w:rPr>
+        <w:t xml:space="preserve">LotAttributeChange</w:t>
+      </w:r>
+      <w:r>
+        <w:t xml:space="preserve">,</w:t>
+      </w:r>
+      <w:r>
+        <w:t xml:space="preserve"> </w:t>
+      </w:r>
+      <w:r>
+        <w:rPr>
+          <w:rStyle w:val="VerbatimChar"/>
+        </w:rPr>
+        <w:t xml:space="preserve">LotLabel</w:t>
+      </w:r>
+      <w:r>
+        <w:t xml:space="preserve">) – none of which Arc 1 built (B-2 correction).</w:t>
       </w:r>
     </w:p>
     <w:p>
@@ -22799,7 +24010,7 @@
           <w:b/>
           <w:bCs/>
         </w:rPr>
-        <w:t xml:space="preserve">sql/migrations/versioned/0015_arc2_phase2_lot_lifecycle.sql</w:t>
+        <w:t xml:space="preserve">sql/migrations/versioned/0021_arc2_phase2_lot_lifecycle.sql</w:t>
       </w:r>
       <w:r>
         <w:t xml:space="preserve"> </w:t>
@@ -22818,6 +24029,522 @@
           <w:bCs/>
         </w:rPr>
         <w:t xml:space="preserve">New tables:</w:t>
+      </w:r>
+    </w:p>
+    <w:p>
+      <w:pPr>
+        <w:pStyle w:val="Compact"/>
+        <w:numPr>
+          <w:ilvl w:val="0"/>
+          <w:numId w:val="1039"/>
+        </w:numPr>
+      </w:pPr>
+      <w:r>
+        <w:rPr>
+          <w:rStyle w:val="VerbatimChar"/>
+          <w:b/>
+          <w:bCs/>
+        </w:rPr>
+        <w:t xml:space="preserve">Lots.LotGenealogy</w:t>
+      </w:r>
+      <w:r>
+        <w:t xml:space="preserve"> </w:t>
+      </w:r>
+      <w:r>
+        <w:t xml:space="preserve">(FDS-05-016) –</w:t>
+      </w:r>
+      <w:r>
+        <w:t xml:space="preserve"> </w:t>
+      </w:r>
+      <w:r>
+        <w:rPr>
+          <w:b/>
+          <w:bCs/>
+        </w:rPr>
+        <w:t xml:space="preserve">CREATE (net-new; never built by Arc 1).</w:t>
+      </w:r>
+      <w:r>
+        <w:t xml:space="preserve"> </w:t>
+      </w:r>
+      <w:r>
+        <w:t xml:space="preserve">Append-only edge table:</w:t>
+      </w:r>
+      <w:r>
+        <w:t xml:space="preserve"> </w:t>
+      </w:r>
+      <w:r>
+        <w:rPr>
+          <w:rStyle w:val="VerbatimChar"/>
+        </w:rPr>
+        <w:t xml:space="preserve">Id BIGINT PK</w:t>
+      </w:r>
+      <w:r>
+        <w:t xml:space="preserve">,</w:t>
+      </w:r>
+      <w:r>
+        <w:t xml:space="preserve"> </w:t>
+      </w:r>
+      <w:r>
+        <w:rPr>
+          <w:rStyle w:val="VerbatimChar"/>
+        </w:rPr>
+        <w:t xml:space="preserve">ParentLotId BIGINT NOT NULL FK -&gt; Lots.Lot.Id</w:t>
+      </w:r>
+      <w:r>
+        <w:t xml:space="preserve">,</w:t>
+      </w:r>
+      <w:r>
+        <w:t xml:space="preserve"> </w:t>
+      </w:r>
+      <w:r>
+        <w:rPr>
+          <w:rStyle w:val="VerbatimChar"/>
+        </w:rPr>
+        <w:t xml:space="preserve">ChildLotId BIGINT NOT NULL FK -&gt; Lots.Lot.Id</w:t>
+      </w:r>
+      <w:r>
+        <w:t xml:space="preserve">,</w:t>
+      </w:r>
+      <w:r>
+        <w:t xml:space="preserve"> </w:t>
+      </w:r>
+      <w:r>
+        <w:rPr>
+          <w:rStyle w:val="VerbatimChar"/>
+        </w:rPr>
+        <w:t xml:space="preserve">RelationshipTypeId BIGINT NOT NULL FK -&gt; Lots.GenealogyRelationshipType.Id</w:t>
+      </w:r>
+      <w:r>
+        <w:t xml:space="preserve"> </w:t>
+      </w:r>
+      <w:r>
+        <w:t xml:space="preserve">(Split/Merge/Consumption),</w:t>
+      </w:r>
+      <w:r>
+        <w:t xml:space="preserve"> </w:t>
+      </w:r>
+      <w:r>
+        <w:rPr>
+          <w:rStyle w:val="VerbatimChar"/>
+        </w:rPr>
+        <w:t xml:space="preserve">PieceCount INT NULL</w:t>
+      </w:r>
+      <w:r>
+        <w:t xml:space="preserve">,</w:t>
+      </w:r>
+      <w:r>
+        <w:t xml:space="preserve"> </w:t>
+      </w:r>
+      <w:r>
+        <w:rPr>
+          <w:rStyle w:val="VerbatimChar"/>
+        </w:rPr>
+        <w:t xml:space="preserve">EventUserId</w:t>
+      </w:r>
+      <w:r>
+        <w:t xml:space="preserve">,</w:t>
+      </w:r>
+      <w:r>
+        <w:t xml:space="preserve"> </w:t>
+      </w:r>
+      <w:r>
+        <w:rPr>
+          <w:rStyle w:val="VerbatimChar"/>
+        </w:rPr>
+        <w:t xml:space="preserve">TerminalLocationId</w:t>
+      </w:r>
+      <w:r>
+        <w:t xml:space="preserve">,</w:t>
+      </w:r>
+      <w:r>
+        <w:t xml:space="preserve"> </w:t>
+      </w:r>
+      <w:r>
+        <w:rPr>
+          <w:rStyle w:val="VerbatimChar"/>
+        </w:rPr>
+        <w:t xml:space="preserve">EventAt</w:t>
+      </w:r>
+      <w:r>
+        <w:t xml:space="preserve">. Written by</w:t>
+      </w:r>
+      <w:r>
+        <w:t xml:space="preserve"> </w:t>
+      </w:r>
+      <w:r>
+        <w:rPr>
+          <w:rStyle w:val="VerbatimChar"/>
+        </w:rPr>
+        <w:t xml:space="preserve">Lot_Split</w:t>
+      </w:r>
+      <w:r>
+        <w:t xml:space="preserve"> </w:t>
+      </w:r>
+      <w:r>
+        <w:t xml:space="preserve">/</w:t>
+      </w:r>
+      <w:r>
+        <w:t xml:space="preserve"> </w:t>
+      </w:r>
+      <w:r>
+        <w:rPr>
+          <w:rStyle w:val="VerbatimChar"/>
+        </w:rPr>
+        <w:t xml:space="preserve">Lot_Merge</w:t>
+      </w:r>
+      <w:r>
+        <w:t xml:space="preserve"> </w:t>
+      </w:r>
+      <w:r>
+        <w:t xml:space="preserve">/</w:t>
+      </w:r>
+      <w:r>
+        <w:t xml:space="preserve"> </w:t>
+      </w:r>
+      <w:r>
+        <w:rPr>
+          <w:rStyle w:val="VerbatimChar"/>
+        </w:rPr>
+        <w:t xml:space="preserve">LotGenealogy_RecordConsumption</w:t>
+      </w:r>
+      <w:r>
+        <w:t xml:space="preserve">; closure rows (B4) maintained transactionally alongside.</w:t>
+      </w:r>
+    </w:p>
+    <w:p>
+      <w:pPr>
+        <w:pStyle w:val="Compact"/>
+        <w:numPr>
+          <w:ilvl w:val="0"/>
+          <w:numId w:val="1039"/>
+        </w:numPr>
+      </w:pPr>
+      <w:r>
+        <w:rPr>
+          <w:rStyle w:val="VerbatimChar"/>
+          <w:b/>
+          <w:bCs/>
+        </w:rPr>
+        <w:t xml:space="preserve">Lots.LotAttributeChange</w:t>
+      </w:r>
+      <w:r>
+        <w:t xml:space="preserve"> </w:t>
+      </w:r>
+      <w:r>
+        <w:t xml:space="preserve">(FDS-05-021) –</w:t>
+      </w:r>
+      <w:r>
+        <w:t xml:space="preserve"> </w:t>
+      </w:r>
+      <w:r>
+        <w:rPr>
+          <w:b/>
+          <w:bCs/>
+        </w:rPr>
+        <w:t xml:space="preserve">CREATE (net-new).</w:t>
+      </w:r>
+      <w:r>
+        <w:t xml:space="preserve"> </w:t>
+      </w:r>
+      <w:r>
+        <w:t xml:space="preserve">Append-only:</w:t>
+      </w:r>
+      <w:r>
+        <w:t xml:space="preserve"> </w:t>
+      </w:r>
+      <w:r>
+        <w:rPr>
+          <w:rStyle w:val="VerbatimChar"/>
+        </w:rPr>
+        <w:t xml:space="preserve">Id</w:t>
+      </w:r>
+      <w:r>
+        <w:t xml:space="preserve">,</w:t>
+      </w:r>
+      <w:r>
+        <w:t xml:space="preserve"> </w:t>
+      </w:r>
+      <w:r>
+        <w:rPr>
+          <w:rStyle w:val="VerbatimChar"/>
+        </w:rPr>
+        <w:t xml:space="preserve">LotId FK -&gt; Lots.Lot.Id</w:t>
+      </w:r>
+      <w:r>
+        <w:t xml:space="preserve">,</w:t>
+      </w:r>
+      <w:r>
+        <w:t xml:space="preserve"> </w:t>
+      </w:r>
+      <w:r>
+        <w:rPr>
+          <w:rStyle w:val="VerbatimChar"/>
+        </w:rPr>
+        <w:t xml:space="preserve">AttributeName</w:t>
+      </w:r>
+      <w:r>
+        <w:t xml:space="preserve">,</w:t>
+      </w:r>
+      <w:r>
+        <w:t xml:space="preserve"> </w:t>
+      </w:r>
+      <w:r>
+        <w:rPr>
+          <w:rStyle w:val="VerbatimChar"/>
+        </w:rPr>
+        <w:t xml:space="preserve">OldValue</w:t>
+      </w:r>
+      <w:r>
+        <w:t xml:space="preserve">,</w:t>
+      </w:r>
+      <w:r>
+        <w:t xml:space="preserve"> </w:t>
+      </w:r>
+      <w:r>
+        <w:rPr>
+          <w:rStyle w:val="VerbatimChar"/>
+        </w:rPr>
+        <w:t xml:space="preserve">NewValue</w:t>
+      </w:r>
+      <w:r>
+        <w:t xml:space="preserve">,</w:t>
+      </w:r>
+      <w:r>
+        <w:t xml:space="preserve"> </w:t>
+      </w:r>
+      <w:r>
+        <w:rPr>
+          <w:rStyle w:val="VerbatimChar"/>
+        </w:rPr>
+        <w:t xml:space="preserve">ChangedByUserId</w:t>
+      </w:r>
+      <w:r>
+        <w:t xml:space="preserve">,</w:t>
+      </w:r>
+      <w:r>
+        <w:t xml:space="preserve"> </w:t>
+      </w:r>
+      <w:r>
+        <w:rPr>
+          <w:rStyle w:val="VerbatimChar"/>
+        </w:rPr>
+        <w:t xml:space="preserve">TerminalLocationId</w:t>
+      </w:r>
+      <w:r>
+        <w:t xml:space="preserve">,</w:t>
+      </w:r>
+      <w:r>
+        <w:t xml:space="preserve"> </w:t>
+      </w:r>
+      <w:r>
+        <w:rPr>
+          <w:rStyle w:val="VerbatimChar"/>
+        </w:rPr>
+        <w:t xml:space="preserve">ChangedAt</w:t>
+      </w:r>
+      <w:r>
+        <w:t xml:space="preserve">. Written by</w:t>
+      </w:r>
+      <w:r>
+        <w:t xml:space="preserve"> </w:t>
+      </w:r>
+      <w:r>
+        <w:rPr>
+          <w:rStyle w:val="VerbatimChar"/>
+        </w:rPr>
+        <w:t xml:space="preserve">Lot_UpdateAttribute</w:t>
+      </w:r>
+      <w:r>
+        <w:t xml:space="preserve">.</w:t>
+      </w:r>
+    </w:p>
+    <w:p>
+      <w:pPr>
+        <w:pStyle w:val="Compact"/>
+        <w:numPr>
+          <w:ilvl w:val="0"/>
+          <w:numId w:val="1039"/>
+        </w:numPr>
+      </w:pPr>
+      <w:r>
+        <w:rPr>
+          <w:rStyle w:val="VerbatimChar"/>
+          <w:b/>
+          <w:bCs/>
+        </w:rPr>
+        <w:t xml:space="preserve">Lots.LotLabel</w:t>
+      </w:r>
+      <w:r>
+        <w:t xml:space="preserve"> </w:t>
+      </w:r>
+      <w:r>
+        <w:t xml:space="preserve">(FDS-05-019) –</w:t>
+      </w:r>
+      <w:r>
+        <w:t xml:space="preserve"> </w:t>
+      </w:r>
+      <w:r>
+        <w:rPr>
+          <w:b/>
+          <w:bCs/>
+        </w:rPr>
+        <w:t xml:space="preserve">CREATE (net-new).</w:t>
+      </w:r>
+      <w:r>
+        <w:t xml:space="preserve"> </w:t>
+      </w:r>
+      <w:r>
+        <w:t xml:space="preserve">Append-only LTT print log:</w:t>
+      </w:r>
+      <w:r>
+        <w:t xml:space="preserve"> </w:t>
+      </w:r>
+      <w:r>
+        <w:rPr>
+          <w:rStyle w:val="VerbatimChar"/>
+        </w:rPr>
+        <w:t xml:space="preserve">Id</w:t>
+      </w:r>
+      <w:r>
+        <w:t xml:space="preserve">,</w:t>
+      </w:r>
+      <w:r>
+        <w:t xml:space="preserve"> </w:t>
+      </w:r>
+      <w:r>
+        <w:rPr>
+          <w:rStyle w:val="VerbatimChar"/>
+        </w:rPr>
+        <w:t xml:space="preserve">LotId FK</w:t>
+      </w:r>
+      <w:r>
+        <w:t xml:space="preserve">,</w:t>
+      </w:r>
+      <w:r>
+        <w:t xml:space="preserve"> </w:t>
+      </w:r>
+      <w:r>
+        <w:rPr>
+          <w:rStyle w:val="VerbatimChar"/>
+        </w:rPr>
+        <w:t xml:space="preserve">LabelTypeCodeId</w:t>
+      </w:r>
+      <w:r>
+        <w:t xml:space="preserve">,</w:t>
+      </w:r>
+      <w:r>
+        <w:t xml:space="preserve"> </w:t>
+      </w:r>
+      <w:r>
+        <w:rPr>
+          <w:rStyle w:val="VerbatimChar"/>
+        </w:rPr>
+        <w:t xml:space="preserve">PrintReasonCodeId</w:t>
+      </w:r>
+      <w:r>
+        <w:t xml:space="preserve">,</w:t>
+      </w:r>
+      <w:r>
+        <w:t xml:space="preserve"> </w:t>
+      </w:r>
+      <w:r>
+        <w:rPr>
+          <w:rStyle w:val="VerbatimChar"/>
+        </w:rPr>
+        <w:t xml:space="preserve">ParentLotId NULL</w:t>
+      </w:r>
+      <w:r>
+        <w:t xml:space="preserve"> </w:t>
+      </w:r>
+      <w:r>
+        <w:t xml:space="preserve">(sublot labels per FDS-05-024),</w:t>
+      </w:r>
+      <w:r>
+        <w:t xml:space="preserve"> </w:t>
+      </w:r>
+      <w:r>
+        <w:rPr>
+          <w:rStyle w:val="VerbatimChar"/>
+        </w:rPr>
+        <w:t xml:space="preserve">ZplContent</w:t>
+      </w:r>
+      <w:r>
+        <w:t xml:space="preserve">,</w:t>
+      </w:r>
+      <w:r>
+        <w:t xml:space="preserve"> </w:t>
+      </w:r>
+      <w:r>
+        <w:rPr>
+          <w:rStyle w:val="VerbatimChar"/>
+        </w:rPr>
+        <w:t xml:space="preserve">PrinterName</w:t>
+      </w:r>
+      <w:r>
+        <w:t xml:space="preserve">,</w:t>
+      </w:r>
+      <w:r>
+        <w:t xml:space="preserve"> </w:t>
+      </w:r>
+      <w:r>
+        <w:rPr>
+          <w:rStyle w:val="VerbatimChar"/>
+        </w:rPr>
+        <w:t xml:space="preserve">PrintedByUserId</w:t>
+      </w:r>
+      <w:r>
+        <w:t xml:space="preserve">,</w:t>
+      </w:r>
+      <w:r>
+        <w:t xml:space="preserve"> </w:t>
+      </w:r>
+      <w:r>
+        <w:rPr>
+          <w:rStyle w:val="VerbatimChar"/>
+        </w:rPr>
+        <w:t xml:space="preserve">TerminalLocationId</w:t>
+      </w:r>
+      <w:r>
+        <w:t xml:space="preserve">,</w:t>
+      </w:r>
+      <w:r>
+        <w:t xml:space="preserve"> </w:t>
+      </w:r>
+      <w:r>
+        <w:rPr>
+          <w:rStyle w:val="VerbatimChar"/>
+        </w:rPr>
+        <w:t xml:space="preserve">PrintedAt</w:t>
+      </w:r>
+      <w:r>
+        <w:t xml:space="preserve">. Written by</w:t>
+      </w:r>
+      <w:r>
+        <w:t xml:space="preserve"> </w:t>
+      </w:r>
+      <w:r>
+        <w:rPr>
+          <w:rStyle w:val="VerbatimChar"/>
+        </w:rPr>
+        <w:t xml:space="preserve">LotLabel_Print</w:t>
+      </w:r>
+      <w:r>
+        <w:t xml:space="preserve"> </w:t>
+      </w:r>
+      <w:r>
+        <w:t xml:space="preserve">/</w:t>
+      </w:r>
+      <w:r>
+        <w:t xml:space="preserve"> </w:t>
+      </w:r>
+      <w:r>
+        <w:rPr>
+          <w:rStyle w:val="VerbatimChar"/>
+        </w:rPr>
+        <w:t xml:space="preserve">LotLabel_Reprint</w:t>
+      </w:r>
+      <w:r>
+        <w:t xml:space="preserve">.</w:t>
       </w:r>
     </w:p>
     <w:p>
@@ -28194,7 +29921,7 @@
         <w:rPr>
           <w:rStyle w:val="VerbatimChar"/>
         </w:rPr>
-        <w:t xml:space="preserve">sql/tests/0015_PlantFloor_Lot_Lifecycle/</w:t>
+        <w:t xml:space="preserve">sql/tests/0021_PlantFloor_Lot_Lifecycle/</w:t>
       </w:r>
       <w:r>
         <w:t xml:space="preserve">:</w:t>
@@ -28542,7 +30269,7 @@
         <w:pStyle w:val="BodyText"/>
       </w:pPr>
       <w:r>
-        <w:t xml:space="preserve">Target: 90–120 passing tests in suite 0015.</w:t>
+        <w:t xml:space="preserve">Target: 90–120 passing tests in suite 0021.</w:t>
       </w:r>
     </w:p>
     <w:bookmarkEnd w:id="84"/>
@@ -28573,7 +30300,7 @@
         <w:rPr>
           <w:rStyle w:val="VerbatimChar"/>
         </w:rPr>
-        <w:t xml:space="preserve">0015_arc2_phase2_lot_lifecycle.sql</w:t>
+        <w:t xml:space="preserve">0021_arc2_phase2_lot_lifecycle.sql</w:t>
       </w:r>
       <w:r>
         <w:t xml:space="preserve"> </w:t>
@@ -28642,7 +30369,7 @@
         <w:rPr>
           <w:rStyle w:val="VerbatimChar"/>
         </w:rPr>
-        <w:t xml:space="preserve">sql/tests/0015_PlantFloor_Lot_Lifecycle/</w:t>
+        <w:t xml:space="preserve">sql/tests/0021_PlantFloor_Lot_Lifecycle/</w:t>
       </w:r>
       <w:r>
         <w:t xml:space="preserve"> </w:t>
@@ -28867,7 +30594,7 @@
           <w:b/>
           <w:bCs/>
         </w:rPr>
-        <w:t xml:space="preserve">sql/migrations/versioned/0016_arc2_phase3_die_cast.sql</w:t>
+        <w:t xml:space="preserve">sql/migrations/versioned/0022_arc2_phase3_die_cast.sql</w:t>
       </w:r>
       <w:r>
         <w:t xml:space="preserve"> </w:t>
@@ -31814,7 +33541,7 @@
         <w:rPr>
           <w:rStyle w:val="VerbatimChar"/>
         </w:rPr>
-        <w:t xml:space="preserve">sql/tests/0016_PlantFloor_DieCast/</w:t>
+        <w:t xml:space="preserve">sql/tests/0022_PlantFloor_DieCast/</w:t>
       </w:r>
       <w:r>
         <w:t xml:space="preserve">:</w:t>
@@ -32006,7 +33733,7 @@
         <w:pStyle w:val="BodyText"/>
       </w:pPr>
       <w:r>
-        <w:t xml:space="preserve">Target: 50–70 passing tests in suite 0016.</w:t>
+        <w:t xml:space="preserve">Target: 50–70 passing tests in suite 0022.</w:t>
       </w:r>
     </w:p>
     <w:bookmarkEnd w:id="99"/>
@@ -32037,7 +33764,7 @@
         <w:rPr>
           <w:rStyle w:val="VerbatimChar"/>
         </w:rPr>
-        <w:t xml:space="preserve">0016_arc2_phase3_die_cast.sql</w:t>
+        <w:t xml:space="preserve">0022_arc2_phase3_die_cast.sql</w:t>
       </w:r>
       <w:r>
         <w:t xml:space="preserve"> </w:t>
@@ -32166,7 +33893,7 @@
         <w:rPr>
           <w:rStyle w:val="VerbatimChar"/>
         </w:rPr>
-        <w:t xml:space="preserve">sql/tests/0016_PlantFloor_DieCast/</w:t>
+        <w:t xml:space="preserve">sql/tests/0022_PlantFloor_DieCast/</w:t>
       </w:r>
       <w:r>
         <w:t xml:space="preserve"> </w:t>
@@ -32451,7 +34178,7 @@
           <w:b/>
           <w:bCs/>
         </w:rPr>
-        <w:t xml:space="preserve">sql/migrations/versioned/0017_arc2_phase4_movement_trim_receiving.sql</w:t>
+        <w:t xml:space="preserve">sql/migrations/versioned/0023_arc2_phase4_movement_trim_receiving.sql</w:t>
       </w:r>
       <w:r>
         <w:t xml:space="preserve"> </w:t>
@@ -32577,7 +34304,7 @@
         <w:rPr>
           <w:rStyle w:val="VerbatimChar"/>
         </w:rPr>
-        <w:t xml:space="preserve">0018</w:t>
+        <w:t xml:space="preserve">0024</w:t>
       </w:r>
       <w:r>
         <w:t xml:space="preserve"> </w:t>
@@ -32712,7 +34439,7 @@
         <w:rPr>
           <w:rStyle w:val="VerbatimChar"/>
         </w:rPr>
-        <w:t xml:space="preserve">0018</w:t>
+        <w:t xml:space="preserve">0024</w:t>
       </w:r>
       <w:r>
         <w:t xml:space="preserve">).</w:t>
@@ -35415,7 +37142,7 @@
         <w:rPr>
           <w:rStyle w:val="VerbatimChar"/>
         </w:rPr>
-        <w:t xml:space="preserve">sql/tests/0017_PlantFloor_Movement_Trim/</w:t>
+        <w:t xml:space="preserve">sql/tests/0023_PlantFloor_Movement_Trim/</w:t>
       </w:r>
       <w:r>
         <w:t xml:space="preserve">:</w:t>
@@ -35739,7 +37466,7 @@
         <w:rPr>
           <w:rStyle w:val="VerbatimChar"/>
         </w:rPr>
-        <w:t xml:space="preserve">0018</w:t>
+        <w:t xml:space="preserve">0024</w:t>
       </w:r>
       <w:r>
         <w:t xml:space="preserve">, where the split now lives.)</w:t>
@@ -35750,7 +37477,7 @@
         <w:pStyle w:val="BodyText"/>
       </w:pPr>
       <w:r>
-        <w:t xml:space="preserve">Target: 55–75 passing tests in suite 0017.</w:t>
+        <w:t xml:space="preserve">Target: 55–75 passing tests in suite 0023.</w:t>
       </w:r>
     </w:p>
     <w:bookmarkEnd w:id="113"/>
@@ -35781,7 +37508,7 @@
         <w:rPr>
           <w:rStyle w:val="VerbatimChar"/>
         </w:rPr>
-        <w:t xml:space="preserve">0017_arc2_phase4_movement_trim_receiving.sql</w:t>
+        <w:t xml:space="preserve">0023_arc2_phase4_movement_trim_receiving.sql</w:t>
       </w:r>
       <w:r>
         <w:t xml:space="preserve"> </w:t>
@@ -35862,7 +37589,7 @@
         <w:rPr>
           <w:rStyle w:val="VerbatimChar"/>
         </w:rPr>
-        <w:t xml:space="preserve">sql/tests/0017_PlantFloor_Movement_Trim/</w:t>
+        <w:t xml:space="preserve">sql/tests/0023_PlantFloor_Movement_Trim/</w:t>
       </w:r>
       <w:r>
         <w:t xml:space="preserve"> </w:t>
@@ -36172,7 +37899,7 @@
           <w:b/>
           <w:bCs/>
         </w:rPr>
-        <w:t xml:space="preserve">sql/migrations/versioned/0018_arc2_phase5_machining.sql</w:t>
+        <w:t xml:space="preserve">sql/migrations/versioned/0024_arc2_phase5_machining.sql</w:t>
       </w:r>
       <w:r>
         <w:t xml:space="preserve"> </w:t>
@@ -40306,7 +42033,7 @@
         <w:rPr>
           <w:rStyle w:val="VerbatimChar"/>
         </w:rPr>
-        <w:t xml:space="preserve">sql/tests/0018_PlantFloor_Machining/</w:t>
+        <w:t xml:space="preserve">sql/tests/0024_PlantFloor_Machining/</w:t>
       </w:r>
       <w:r>
         <w:t xml:space="preserve">:</w:t>
@@ -40780,7 +42507,7 @@
         <w:pStyle w:val="BodyText"/>
       </w:pPr>
       <w:r>
-        <w:t xml:space="preserve">Target: 80–110 passing tests in suite 0018.</w:t>
+        <w:t xml:space="preserve">Target: 80–110 passing tests in suite 0024.</w:t>
       </w:r>
     </w:p>
     <w:bookmarkEnd w:id="126"/>
@@ -40811,7 +42538,7 @@
         <w:rPr>
           <w:rStyle w:val="VerbatimChar"/>
         </w:rPr>
-        <w:t xml:space="preserve">0018_arc2_phase5_machining.sql</w:t>
+        <w:t xml:space="preserve">0024_arc2_phase5_machining.sql</w:t>
       </w:r>
       <w:r>
         <w:t xml:space="preserve"> </w:t>
@@ -40916,7 +42643,7 @@
         <w:rPr>
           <w:rStyle w:val="VerbatimChar"/>
         </w:rPr>
-        <w:t xml:space="preserve">sql/tests/0018_PlantFloor_Machining/</w:t>
+        <w:t xml:space="preserve">sql/tests/0024_PlantFloor_Machining/</w:t>
       </w:r>
       <w:r>
         <w:t xml:space="preserve"> </w:t>
@@ -41309,7 +43036,7 @@
           <w:b/>
           <w:bCs/>
         </w:rPr>
-        <w:t xml:space="preserve">sql/migrations/versioned/0019_arc2_phase6_assembly.sql</w:t>
+        <w:t xml:space="preserve">sql/migrations/versioned/0025_arc2_phase6_assembly.sql</w:t>
       </w:r>
       <w:r>
         <w:t xml:space="preserve"> </w:t>
@@ -41857,6 +43584,270 @@
     </w:p>
     <w:p>
       <w:pPr>
+        <w:pStyle w:val="Compact"/>
+        <w:numPr>
+          <w:ilvl w:val="0"/>
+          <w:numId w:val="1092"/>
+        </w:numPr>
+      </w:pPr>
+      <w:r>
+        <w:rPr>
+          <w:rStyle w:val="VerbatimChar"/>
+        </w:rPr>
+        <w:t xml:space="preserve">Lots.ShippingLabel</w:t>
+      </w:r>
+      <w:r>
+        <w:t xml:space="preserve"> </w:t>
+      </w:r>
+      <w:r>
+        <w:t xml:space="preserve">–</w:t>
+      </w:r>
+      <w:r>
+        <w:t xml:space="preserve"> </w:t>
+      </w:r>
+      <w:r>
+        <w:rPr>
+          <w:b/>
+          <w:bCs/>
+        </w:rPr>
+        <w:t xml:space="preserve">CREATE (per C-5 –</w:t>
+      </w:r>
+      <w:r>
+        <w:rPr>
+          <w:b/>
+          <w:bCs/>
+        </w:rPr>
+        <w:t xml:space="preserve"> </w:t>
+      </w:r>
+      <w:r>
+        <w:rPr>
+          <w:rStyle w:val="VerbatimChar"/>
+          <w:b/>
+          <w:bCs/>
+        </w:rPr>
+        <w:t xml:space="preserve">Container_Complete</w:t>
+      </w:r>
+      <w:r>
+        <w:rPr>
+          <w:b/>
+          <w:bCs/>
+        </w:rPr>
+        <w:t xml:space="preserve"> </w:t>
+      </w:r>
+      <w:r>
+        <w:rPr>
+          <w:b/>
+          <w:bCs/>
+        </w:rPr>
+        <w:t xml:space="preserve">inserts it; was missing from the plan’s CREATE list).</w:t>
+      </w:r>
+      <w:r>
+        <w:t xml:space="preserve"> </w:t>
+      </w:r>
+      <w:r>
+        <w:t xml:space="preserve">Container shipping-label print/void/reprint history. Columns:</w:t>
+      </w:r>
+      <w:r>
+        <w:t xml:space="preserve"> </w:t>
+      </w:r>
+      <w:r>
+        <w:rPr>
+          <w:rStyle w:val="VerbatimChar"/>
+        </w:rPr>
+        <w:t xml:space="preserve">Id BIGINT PK</w:t>
+      </w:r>
+      <w:r>
+        <w:t xml:space="preserve">,</w:t>
+      </w:r>
+      <w:r>
+        <w:t xml:space="preserve"> </w:t>
+      </w:r>
+      <w:r>
+        <w:rPr>
+          <w:rStyle w:val="VerbatimChar"/>
+        </w:rPr>
+        <w:t xml:space="preserve">ContainerId BIGINT FK -&gt; Container.Id</w:t>
+      </w:r>
+      <w:r>
+        <w:t xml:space="preserve">,</w:t>
+      </w:r>
+      <w:r>
+        <w:t xml:space="preserve"> </w:t>
+      </w:r>
+      <w:r>
+        <w:rPr>
+          <w:rStyle w:val="VerbatimChar"/>
+        </w:rPr>
+        <w:t xml:space="preserve">AimShipperId NVARCHAR(50) NOT NULL</w:t>
+      </w:r>
+      <w:r>
+        <w:t xml:space="preserve"> </w:t>
+      </w:r>
+      <w:r>
+        <w:t xml:space="preserve">(from</w:t>
+      </w:r>
+      <w:r>
+        <w:t xml:space="preserve"> </w:t>
+      </w:r>
+      <w:r>
+        <w:rPr>
+          <w:rStyle w:val="VerbatimChar"/>
+        </w:rPr>
+        <w:t xml:space="preserve">AimShipperIdPool_Claim</w:t>
+      </w:r>
+      <w:r>
+        <w:t xml:space="preserve">),</w:t>
+      </w:r>
+      <w:r>
+        <w:t xml:space="preserve"> </w:t>
+      </w:r>
+      <w:r>
+        <w:rPr>
+          <w:rStyle w:val="VerbatimChar"/>
+        </w:rPr>
+        <w:t xml:space="preserve">LabelTypeCodeId BIGINT FK -&gt; Lots.LabelTypeCode.Id</w:t>
+      </w:r>
+      <w:r>
+        <w:t xml:space="preserve">,</w:t>
+      </w:r>
+      <w:r>
+        <w:t xml:space="preserve"> </w:t>
+      </w:r>
+      <w:r>
+        <w:rPr>
+          <w:rStyle w:val="VerbatimChar"/>
+        </w:rPr>
+        <w:t xml:space="preserve">PrintedByUserId</w:t>
+      </w:r>
+      <w:r>
+        <w:t xml:space="preserve">,</w:t>
+      </w:r>
+      <w:r>
+        <w:t xml:space="preserve"> </w:t>
+      </w:r>
+      <w:r>
+        <w:rPr>
+          <w:rStyle w:val="VerbatimChar"/>
+        </w:rPr>
+        <w:t xml:space="preserve">TerminalLocationId</w:t>
+      </w:r>
+      <w:r>
+        <w:t xml:space="preserve">,</w:t>
+      </w:r>
+      <w:r>
+        <w:t xml:space="preserve"> </w:t>
+      </w:r>
+      <w:r>
+        <w:rPr>
+          <w:rStyle w:val="VerbatimChar"/>
+        </w:rPr>
+        <w:t xml:space="preserve">IsVoid BIT DEFAULT 0</w:t>
+      </w:r>
+      <w:r>
+        <w:t xml:space="preserve">,</w:t>
+      </w:r>
+      <w:r>
+        <w:t xml:space="preserve"> </w:t>
+      </w:r>
+      <w:r>
+        <w:rPr>
+          <w:rStyle w:val="VerbatimChar"/>
+        </w:rPr>
+        <w:t xml:space="preserve">PrintedAt NULL</w:t>
+      </w:r>
+      <w:r>
+        <w:t xml:space="preserve">,</w:t>
+      </w:r>
+      <w:r>
+        <w:t xml:space="preserve"> </w:t>
+      </w:r>
+      <w:r>
+        <w:rPr>
+          <w:rStyle w:val="VerbatimChar"/>
+        </w:rPr>
+        <w:t xml:space="preserve">VoidedAt NULL</w:t>
+      </w:r>
+      <w:r>
+        <w:t xml:space="preserve">,</w:t>
+      </w:r>
+      <w:r>
+        <w:t xml:space="preserve"> </w:t>
+      </w:r>
+      <w:r>
+        <w:rPr>
+          <w:rStyle w:val="VerbatimChar"/>
+        </w:rPr>
+        <w:t xml:space="preserve">VoidedByUserId NULL</w:t>
+      </w:r>
+      <w:r>
+        <w:t xml:space="preserve">,</w:t>
+      </w:r>
+      <w:r>
+        <w:t xml:space="preserve"> </w:t>
+      </w:r>
+      <w:r>
+        <w:rPr>
+          <w:rStyle w:val="VerbatimChar"/>
+        </w:rPr>
+        <w:t xml:space="preserve">PrintAttempts INT DEFAULT 0</w:t>
+      </w:r>
+      <w:r>
+        <w:t xml:space="preserve">,</w:t>
+      </w:r>
+      <w:r>
+        <w:t xml:space="preserve"> </w:t>
+      </w:r>
+      <w:r>
+        <w:rPr>
+          <w:rStyle w:val="VerbatimChar"/>
+        </w:rPr>
+        <w:t xml:space="preserve">LastPrintAttemptAt NULL</w:t>
+      </w:r>
+      <w:r>
+        <w:t xml:space="preserve">,</w:t>
+      </w:r>
+      <w:r>
+        <w:t xml:space="preserve"> </w:t>
+      </w:r>
+      <w:r>
+        <w:rPr>
+          <w:rStyle w:val="VerbatimChar"/>
+        </w:rPr>
+        <w:t xml:space="preserve">LastPrintError NULL</w:t>
+      </w:r>
+      <w:r>
+        <w:t xml:space="preserve">,</w:t>
+      </w:r>
+      <w:r>
+        <w:t xml:space="preserve"> </w:t>
+      </w:r>
+      <w:r>
+        <w:rPr>
+          <w:rStyle w:val="VerbatimChar"/>
+        </w:rPr>
+        <w:t xml:space="preserve">PrintFailedAt NULL</w:t>
+      </w:r>
+      <w:r>
+        <w:t xml:space="preserve">,</w:t>
+      </w:r>
+      <w:r>
+        <w:t xml:space="preserve"> </w:t>
+      </w:r>
+      <w:r>
+        <w:rPr>
+          <w:rStyle w:val="VerbatimChar"/>
+        </w:rPr>
+        <w:t xml:space="preserve">BannerAcknowledgedAt NULL</w:t>
+      </w:r>
+      <w:r>
+        <w:t xml:space="preserve"> </w:t>
+      </w:r>
+      <w:r>
+        <w:t xml:space="preserve">(FDS-07-006a/b print-failure surfacing). Phase 7 reads / voids / reprints it – it does not re-CREATE it.</w:t>
+      </w:r>
+    </w:p>
+    <w:p>
+      <w:pPr>
         <w:pStyle w:val="FirstParagraph"/>
       </w:pPr>
       <w:r>
@@ -41952,6 +43943,18 @@
           <w:rStyle w:val="VerbatimChar"/>
         </w:rPr>
         <w:t xml:space="preserve">SerializedPart</w:t>
+      </w:r>
+      <w:r>
+        <w:t xml:space="preserve">,</w:t>
+      </w:r>
+      <w:r>
+        <w:t xml:space="preserve"> </w:t>
+      </w:r>
+      <w:r>
+        <w:rPr>
+          <w:rStyle w:val="VerbatimChar"/>
+        </w:rPr>
+        <w:t xml:space="preserve">ShippingLabel</w:t>
       </w:r>
       <w:r>
         <w:t xml:space="preserve">.</w:t>
@@ -46463,7 +48466,7 @@
         <w:rPr>
           <w:rStyle w:val="VerbatimChar"/>
         </w:rPr>
-        <w:t xml:space="preserve">sql/tests/0019_PlantFloor_Assembly/</w:t>
+        <w:t xml:space="preserve">sql/tests/0025_PlantFloor_Assembly/</w:t>
       </w:r>
       <w:r>
         <w:t xml:space="preserve">:</w:t>
@@ -46913,7 +48916,7 @@
         <w:pStyle w:val="BodyText"/>
       </w:pPr>
       <w:r>
-        <w:t xml:space="preserve">Target: 100–135 passing tests in suite 0019.</w:t>
+        <w:t xml:space="preserve">Target: 100–135 passing tests in suite 0025.</w:t>
       </w:r>
     </w:p>
     <w:bookmarkEnd w:id="142"/>
@@ -46944,7 +48947,7 @@
         <w:rPr>
           <w:rStyle w:val="VerbatimChar"/>
         </w:rPr>
-        <w:t xml:space="preserve">0019_arc2_phase6_assembly.sql</w:t>
+        <w:t xml:space="preserve">0025_arc2_phase6_assembly.sql</w:t>
       </w:r>
       <w:r>
         <w:t xml:space="preserve"> </w:t>
@@ -46983,7 +48986,7 @@
         <w:rPr>
           <w:rStyle w:val="VerbatimChar"/>
         </w:rPr>
-        <w:t xml:space="preserve">sql/tests/0019_PlantFloor_Assembly/</w:t>
+        <w:t xml:space="preserve">sql/tests/0025_PlantFloor_Assembly/</w:t>
       </w:r>
       <w:r>
         <w:t xml:space="preserve"> </w:t>
@@ -47346,7 +49349,7 @@
           <w:b/>
           <w:bCs/>
         </w:rPr>
-        <w:t xml:space="preserve">sql/migrations/versioned/0020_arc2_phase7_hold_sort_shipping_aim.sql</w:t>
+        <w:t xml:space="preserve">sql/migrations/versioned/0026_arc2_phase7_hold_sort_shipping_aim.sql</w:t>
       </w:r>
       <w:r>
         <w:t xml:space="preserve"> </w:t>
@@ -47385,7 +49388,23 @@
         <w:t xml:space="preserve"> </w:t>
       </w:r>
       <w:r>
-        <w:t xml:space="preserve">(if not already in Phase 1 — confirm during Phase 0 scoping). Columns per Data Model v1.9l §5:</w:t>
+        <w:t xml:space="preserve">–</w:t>
+      </w:r>
+      <w:r>
+        <w:t xml:space="preserve"> </w:t>
+      </w:r>
+      <w:r>
+        <w:rPr>
+          <w:b/>
+          <w:bCs/>
+        </w:rPr>
+        <w:t xml:space="preserve">CREATE here (C-4: this is its owning phase; it is NOT created in Phase 1).</w:t>
+      </w:r>
+      <w:r>
+        <w:t xml:space="preserve"> </w:t>
+      </w:r>
+      <w:r>
+        <w:t xml:space="preserve">Columns per Data Model v1.9o section 5:</w:t>
       </w:r>
       <w:r>
         <w:t xml:space="preserve"> </w:t>
@@ -52779,7 +54798,7 @@
         <w:rPr>
           <w:rStyle w:val="VerbatimChar"/>
         </w:rPr>
-        <w:t xml:space="preserve">sql/tests/0020_PlantFloor_Hold_Sort_Shipping_Aim/</w:t>
+        <w:t xml:space="preserve">sql/tests/0026_PlantFloor_Hold_Sort_Shipping_Aim/</w:t>
       </w:r>
       <w:r>
         <w:t xml:space="preserve">:</w:t>
@@ -53091,7 +55110,7 @@
         <w:pStyle w:val="BodyText"/>
       </w:pPr>
       <w:r>
-        <w:t xml:space="preserve">Target: 90–120 passing tests in suite 0020.</w:t>
+        <w:t xml:space="preserve">Target: 90–120 passing tests in suite 0026.</w:t>
       </w:r>
     </w:p>
     <w:bookmarkEnd w:id="160"/>
@@ -53122,7 +55141,7 @@
         <w:rPr>
           <w:rStyle w:val="VerbatimChar"/>
         </w:rPr>
-        <w:t xml:space="preserve">0020_arc2_phase7_hold_sort_shipping_aim.sql</w:t>
+        <w:t xml:space="preserve">0026_arc2_phase7_hold_sort_shipping_aim.sql</w:t>
       </w:r>
       <w:r>
         <w:t xml:space="preserve"> </w:t>
@@ -53161,7 +55180,7 @@
         <w:rPr>
           <w:rStyle w:val="VerbatimChar"/>
         </w:rPr>
-        <w:t xml:space="preserve">sql/tests/0020_PlantFloor_Hold_Sort_Shipping_Aim/</w:t>
+        <w:t xml:space="preserve">sql/tests/0026_PlantFloor_Hold_Sort_Shipping_Aim/</w:t>
       </w:r>
       <w:r>
         <w:t xml:space="preserve"> </w:t>
@@ -53191,7 +55210,7 @@
         </w:numPr>
       </w:pPr>
       <w:r>
-        <w:t xml:space="preserve">All five Gateway scripts (Topup, AlarmMonitor, AimHoldHandler, AimUpdateHandler, PrintFailureSafetySweep, PrintFailureBroadcaster) implemented and tested.</w:t>
+        <w:t xml:space="preserve">All six Gateway scripts (Topup, AlarmMonitor, AimHoldHandler, AimUpdateHandler, PrintFailureSafetySweep, PrintFailureBroadcaster) implemented and tested.</w:t>
       </w:r>
     </w:p>
     <w:p>
@@ -53291,7 +55310,7 @@
     </w:p>
     <w:bookmarkEnd w:id="161"/>
     <w:bookmarkEnd w:id="162"/>
-    <w:bookmarkStart w:id="180" w:name="Xb5b958ffc4d0425d2067080e3f40551f699de3f"/>
+    <w:bookmarkStart w:id="177" w:name="Xb5b958ffc4d0425d2067080e3f40551f699de3f"/>
     <w:p>
       <w:pPr>
         <w:pStyle w:val="Heading1"/>
@@ -53387,7 +55406,7 @@
           <w:b/>
           <w:bCs/>
         </w:rPr>
-        <w:t xml:space="preserve">sql/migrations/versioned/0021_arc2_phase8_downtime_shift.sql</w:t>
+        <w:t xml:space="preserve">sql/migrations/versioned/0027_arc2_phase8_downtime_shift.sql</w:t>
       </w:r>
       <w:r>
         <w:t xml:space="preserve"> </w:t>
@@ -53414,7 +55433,23 @@
         <w:t xml:space="preserve"> </w:t>
       </w:r>
       <w:r>
-        <w:t xml:space="preserve">— CREATE per Data Model v1.9l §6 if not already in Phase 1:</w:t>
+        <w:t xml:space="preserve">–</w:t>
+      </w:r>
+      <w:r>
+        <w:t xml:space="preserve"> </w:t>
+      </w:r>
+      <w:r>
+        <w:rPr>
+          <w:b/>
+          <w:bCs/>
+        </w:rPr>
+        <w:t xml:space="preserve">CREATE here (C-4: Phase 8 owns it; it is NOT created in Phase 1).</w:t>
+      </w:r>
+      <w:r>
+        <w:t xml:space="preserve"> </w:t>
+      </w:r>
+      <w:r>
+        <w:t xml:space="preserve">Per Data Model v1.9o section 6:</w:t>
       </w:r>
       <w:r>
         <w:t xml:space="preserve"> </w:t>
@@ -56148,7 +58183,7 @@
         <w:rPr>
           <w:rStyle w:val="VerbatimChar"/>
         </w:rPr>
-        <w:t xml:space="preserve">sql/tests/0021_PlantFloor_Downtime_Shift/</w:t>
+        <w:t xml:space="preserve">sql/tests/0027_PlantFloor_Downtime_Shift/</w:t>
       </w:r>
       <w:r>
         <w:t xml:space="preserve">:</w:t>
@@ -56427,7 +58462,7 @@
         <w:pStyle w:val="BodyText"/>
       </w:pPr>
       <w:r>
-        <w:t xml:space="preserve">Target: 60–80 passing tests in suite 0021.</w:t>
+        <w:t xml:space="preserve">Target: 60–80 passing tests in suite 0027.</w:t>
       </w:r>
     </w:p>
     <w:bookmarkEnd w:id="175"/>
@@ -56458,7 +58493,7 @@
         <w:rPr>
           <w:rStyle w:val="VerbatimChar"/>
         </w:rPr>
-        <w:t xml:space="preserve">0021_arc2_phase8_downtime_shift.sql</w:t>
+        <w:t xml:space="preserve">0027_arc2_phase8_downtime_shift.sql</w:t>
       </w:r>
       <w:r>
         <w:t xml:space="preserve"> </w:t>
@@ -56497,7 +58532,7 @@
         <w:rPr>
           <w:rStyle w:val="VerbatimChar"/>
         </w:rPr>
-        <w:t xml:space="preserve">sql/tests/0021_PlantFloor_Downtime_Shift/</w:t>
+        <w:t xml:space="preserve">sql/tests/0027_PlantFloor_Downtime_Shift/</w:t>
       </w:r>
       <w:r>
         <w:t xml:space="preserve"> </w:t>
@@ -56575,13 +58610,152 @@
       </w:r>
     </w:p>
     <w:bookmarkEnd w:id="176"/>
-    <w:bookmarkStart w:id="177" w:name="out-of-scope"/>
+    <w:bookmarkEnd w:id="177"/>
+    <w:bookmarkStart w:id="186" w:name="X5a899efb5457fccc494e640dd513a75d95d4c7c"/>
+    <w:p>
+      <w:pPr>
+        <w:pStyle w:val="Heading1"/>
+      </w:pPr>
+      <w:r>
+        <w:t xml:space="preserve">Phase 9 — Quality Capture, Controlled Run Tag &amp; Global Trace (MVP gap-closure)</w:t>
+      </w:r>
+    </w:p>
+    <w:p>
+      <w:pPr>
+        <w:pStyle w:val="FirstParagraph"/>
+      </w:pPr>
+      <w:r>
+        <w:rPr>
+          <w:b/>
+          <w:bCs/>
+        </w:rPr>
+        <w:t xml:space="preserve">Goal:</w:t>
+      </w:r>
+      <w:r>
+        <w:t xml:space="preserve"> </w:t>
+      </w:r>
+      <w:r>
+        <w:t xml:space="preserve">Close the three MVP requirements the prior plan revisions left unhomed, ratified in-scope by MPP 2026-06-08: operator</w:t>
+      </w:r>
+      <w:r>
+        <w:t xml:space="preserve"> </w:t>
+      </w:r>
+      <w:r>
+        <w:rPr>
+          <w:b/>
+          <w:bCs/>
+        </w:rPr>
+        <w:t xml:space="preserve">inspection recording</w:t>
+      </w:r>
+      <w:r>
+        <w:t xml:space="preserve">, the</w:t>
+      </w:r>
+      <w:r>
+        <w:t xml:space="preserve"> </w:t>
+      </w:r>
+      <w:r>
+        <w:rPr>
+          <w:b/>
+          <w:bCs/>
+        </w:rPr>
+        <w:t xml:space="preserve">Controlled Run Tag</w:t>
+      </w:r>
+      <w:r>
+        <w:t xml:space="preserve"> </w:t>
+      </w:r>
+      <w:r>
+        <w:t xml:space="preserve">workflow, and the</w:t>
+      </w:r>
+      <w:r>
+        <w:t xml:space="preserve"> </w:t>
+      </w:r>
+      <w:r>
+        <w:rPr>
+          <w:b/>
+          <w:bCs/>
+        </w:rPr>
+        <w:t xml:space="preserve">Global Trace Tool</w:t>
+      </w:r>
+      <w:r>
+        <w:t xml:space="preserve"> </w:t>
+      </w:r>
+      <w:r>
+        <w:t xml:space="preserve">+ LOT Genealogy Report. (The legacy PD operational reports remain deferred — see Out of Scope.)</w:t>
+      </w:r>
+    </w:p>
+    <w:p>
+      <w:pPr>
+        <w:pStyle w:val="BodyText"/>
+      </w:pPr>
+      <w:r>
+        <w:rPr>
+          <w:b/>
+          <w:bCs/>
+        </w:rPr>
+        <w:t xml:space="preserve">Dependencies:</w:t>
+      </w:r>
+      <w:r>
+        <w:t xml:space="preserve"> </w:t>
+      </w:r>
+      <w:r>
+        <w:t xml:space="preserve">Phases 1–7 (reads LOT / event / container / quality data across the board). The</w:t>
+      </w:r>
+      <w:r>
+        <w:t xml:space="preserve"> </w:t>
+      </w:r>
+      <w:r>
+        <w:rPr>
+          <w:rStyle w:val="VerbatimChar"/>
+        </w:rPr>
+        <w:t xml:space="preserve">Lot.CrtActive</w:t>
+      </w:r>
+      <w:r>
+        <w:t xml:space="preserve"> </w:t>
+      </w:r>
+      <w:r>
+        <w:t xml:space="preserve">schema hook ships earlier, in the Phase 1</w:t>
+      </w:r>
+      <w:r>
+        <w:t xml:space="preserve"> </w:t>
+      </w:r>
+      <w:r>
+        <w:rPr>
+          <w:rStyle w:val="VerbatimChar"/>
+        </w:rPr>
+        <w:t xml:space="preserve">Lots.Lot</w:t>
+      </w:r>
+      <w:r>
+        <w:t xml:space="preserve"> </w:t>
+      </w:r>
+      <w:r>
+        <w:t xml:space="preserve">CREATE (Data Model v1.9q).</w:t>
+      </w:r>
+    </w:p>
+    <w:p>
+      <w:pPr>
+        <w:pStyle w:val="BodyText"/>
+      </w:pPr>
+      <w:r>
+        <w:rPr>
+          <w:b/>
+          <w:bCs/>
+        </w:rPr>
+        <w:t xml:space="preserve">Status:</w:t>
+      </w:r>
+      <w:r>
+        <w:t xml:space="preserve"> </w:t>
+      </w:r>
+      <w:r>
+        <w:t xml:space="preserve">In scope (2026-06-08). Only the PD-report subset stays deferred.</w:t>
+      </w:r>
+    </w:p>
+    <w:bookmarkStart w:id="178" w:name="data-model-changes-9"/>
     <w:p>
       <w:pPr>
         <w:pStyle w:val="Heading2"/>
       </w:pPr>
       <w:r>
-        <w:t xml:space="preserve">Out of Scope</w:t>
+        <w:t xml:space="preserve">Data Model Changes</w:t>
       </w:r>
     </w:p>
     <w:p>
@@ -56589,7 +58763,44 @@
         <w:pStyle w:val="FirstParagraph"/>
       </w:pPr>
       <w:r>
-        <w:t xml:space="preserve">Explicitly excluded from this plan — handled elsewhere or deferred:</w:t>
+        <w:rPr>
+          <w:b/>
+          <w:bCs/>
+        </w:rPr>
+        <w:t xml:space="preserve">Migration</w:t>
+      </w:r>
+      <w:r>
+        <w:rPr>
+          <w:b/>
+          <w:bCs/>
+        </w:rPr>
+        <w:t xml:space="preserve"> </w:t>
+      </w:r>
+      <w:r>
+        <w:rPr>
+          <w:rStyle w:val="VerbatimChar"/>
+          <w:b/>
+          <w:bCs/>
+        </w:rPr>
+        <w:t xml:space="preserve">sql/migrations/versioned/0028_arc2_phase9_quality_capture.sql</w:t>
+      </w:r>
+      <w:r>
+        <w:t xml:space="preserve"> </w:t>
+      </w:r>
+      <w:r>
+        <w:t xml:space="preserve">(next free after the Phase-8 migration).</w:t>
+      </w:r>
+    </w:p>
+    <w:p>
+      <w:pPr>
+        <w:pStyle w:val="BodyText"/>
+      </w:pPr>
+      <w:r>
+        <w:rPr>
+          <w:b/>
+          <w:bCs/>
+        </w:rPr>
+        <w:t xml:space="preserve">New tables — inspection recording (FDS-08-011 / 012 / 013; specified in Data Model section 5, never built):</w:t>
       </w:r>
     </w:p>
     <w:p>
@@ -56602,25 +58813,114 @@
       </w:pPr>
       <w:r>
         <w:rPr>
-          <w:b/>
-          <w:bCs/>
-        </w:rPr>
-        <w:t xml:space="preserve">OEE Snapshot calculation.</w:t>
-      </w:r>
-      <w:r>
-        <w:t xml:space="preserve"> </w:t>
-      </w:r>
-      <w:r>
-        <w:rPr>
-          <w:rStyle w:val="VerbatimChar"/>
-        </w:rPr>
-        <w:t xml:space="preserve">Oee.OeeSnapshot</w:t>
-      </w:r>
-      <w:r>
-        <w:t xml:space="preserve"> </w:t>
-      </w:r>
-      <w:r>
-        <w:t xml:space="preserve">table exists in the data model as FUTURE scope. No Phase is dedicated to it; no stored procs, no Gateway scripts. Post-MVP workstream.</w:t>
+          <w:rStyle w:val="VerbatimChar"/>
+        </w:rPr>
+        <w:t xml:space="preserve">Quality.QualitySample</w:t>
+      </w:r>
+      <w:r>
+        <w:t xml:space="preserve"> </w:t>
+      </w:r>
+      <w:r>
+        <w:t xml:space="preserve">— CREATE. Inspection header:</w:t>
+      </w:r>
+      <w:r>
+        <w:t xml:space="preserve"> </w:t>
+      </w:r>
+      <w:r>
+        <w:rPr>
+          <w:rStyle w:val="VerbatimChar"/>
+        </w:rPr>
+        <w:t xml:space="preserve">Id</w:t>
+      </w:r>
+      <w:r>
+        <w:t xml:space="preserve">,</w:t>
+      </w:r>
+      <w:r>
+        <w:t xml:space="preserve"> </w:t>
+      </w:r>
+      <w:r>
+        <w:rPr>
+          <w:rStyle w:val="VerbatimChar"/>
+        </w:rPr>
+        <w:t xml:space="preserve">LotId FK -&gt; Lots.Lot.Id</w:t>
+      </w:r>
+      <w:r>
+        <w:t xml:space="preserve">,</w:t>
+      </w:r>
+      <w:r>
+        <w:t xml:space="preserve"> </w:t>
+      </w:r>
+      <w:r>
+        <w:rPr>
+          <w:rStyle w:val="VerbatimChar"/>
+        </w:rPr>
+        <w:t xml:space="preserve">QualitySpecVersionId FK -&gt; Quality.QualitySpecVersion.Id</w:t>
+      </w:r>
+      <w:r>
+        <w:t xml:space="preserve">,</w:t>
+      </w:r>
+      <w:r>
+        <w:t xml:space="preserve"> </w:t>
+      </w:r>
+      <w:r>
+        <w:rPr>
+          <w:rStyle w:val="VerbatimChar"/>
+        </w:rPr>
+        <w:t xml:space="preserve">LocationId NULL</w:t>
+      </w:r>
+      <w:r>
+        <w:t xml:space="preserve">,</w:t>
+      </w:r>
+      <w:r>
+        <w:t xml:space="preserve"> </w:t>
+      </w:r>
+      <w:r>
+        <w:rPr>
+          <w:rStyle w:val="VerbatimChar"/>
+        </w:rPr>
+        <w:t xml:space="preserve">SampleTriggerCodeId NULL</w:t>
+      </w:r>
+      <w:r>
+        <w:t xml:space="preserve">,</w:t>
+      </w:r>
+      <w:r>
+        <w:t xml:space="preserve"> </w:t>
+      </w:r>
+      <w:r>
+        <w:rPr>
+          <w:rStyle w:val="VerbatimChar"/>
+        </w:rPr>
+        <w:t xml:space="preserve">SampledByUserId FK -&gt; AppUser.Id</w:t>
+      </w:r>
+      <w:r>
+        <w:t xml:space="preserve">,</w:t>
+      </w:r>
+      <w:r>
+        <w:t xml:space="preserve"> </w:t>
+      </w:r>
+      <w:r>
+        <w:rPr>
+          <w:rStyle w:val="VerbatimChar"/>
+        </w:rPr>
+        <w:t xml:space="preserve">InspectionResultCodeId FK</w:t>
+      </w:r>
+      <w:r>
+        <w:t xml:space="preserve"> </w:t>
+      </w:r>
+      <w:r>
+        <w:t xml:space="preserve">(overall pass/fail),</w:t>
+      </w:r>
+      <w:r>
+        <w:t xml:space="preserve"> </w:t>
+      </w:r>
+      <w:r>
+        <w:rPr>
+          <w:rStyle w:val="VerbatimChar"/>
+        </w:rPr>
+        <w:t xml:space="preserve">SampledAt</w:t>
+      </w:r>
+      <w:r>
+        <w:t xml:space="preserve">.</w:t>
       </w:r>
     </w:p>
     <w:p>
@@ -56633,25 +58933,24 @@
       </w:pPr>
       <w:r>
         <w:rPr>
-          <w:b/>
-          <w:bCs/>
-        </w:rPr>
-        <w:t xml:space="preserve">PD Reports replacement.</w:t>
-      </w:r>
-      <w:r>
-        <w:t xml:space="preserve"> </w:t>
-      </w:r>
-      <w:r>
-        <w:t xml:space="preserve">The four legacy Productivity Database reports (Die Shot, Rejects, Downtime, Production) are a separate Reporting workstream driven from the data captured here. Ignition Reporting module or an equivalent tool will consume the</w:t>
-      </w:r>
-      <w:r>
-        <w:t xml:space="preserve"> </w:t>
-      </w:r>
-      <w:r>
-        <w:rPr>
-          <w:rStyle w:val="VerbatimChar"/>
-        </w:rPr>
-        <w:t xml:space="preserve">ProductionEvent</w:t>
+          <w:rStyle w:val="VerbatimChar"/>
+        </w:rPr>
+        <w:t xml:space="preserve">Quality.QualityResult</w:t>
+      </w:r>
+      <w:r>
+        <w:t xml:space="preserve"> </w:t>
+      </w:r>
+      <w:r>
+        <w:t xml:space="preserve">— CREATE. Per-attribute result:</w:t>
+      </w:r>
+      <w:r>
+        <w:t xml:space="preserve"> </w:t>
+      </w:r>
+      <w:r>
+        <w:rPr>
+          <w:rStyle w:val="VerbatimChar"/>
+        </w:rPr>
+        <w:t xml:space="preserve">Id</w:t>
       </w:r>
       <w:r>
         <w:t xml:space="preserve">,</w:t>
@@ -56663,7 +58962,7 @@
         <w:rPr>
           <w:rStyle w:val="VerbatimChar"/>
         </w:rPr>
-        <w:t xml:space="preserve">RejectEvent</w:t>
+        <w:t xml:space="preserve">QualitySampleId FK</w:t>
       </w:r>
       <w:r>
         <w:t xml:space="preserve">,</w:t>
@@ -56675,57 +58974,49 @@
         <w:rPr>
           <w:rStyle w:val="VerbatimChar"/>
         </w:rPr>
-        <w:t xml:space="preserve">DowntimeEvent</w:t>
-      </w:r>
-      <w:r>
-        <w:t xml:space="preserve">, and</w:t>
-      </w:r>
-      <w:r>
-        <w:t xml:space="preserve"> </w:t>
-      </w:r>
-      <w:r>
-        <w:rPr>
-          <w:rStyle w:val="VerbatimChar"/>
-        </w:rPr>
-        <w:t xml:space="preserve">Shift</w:t>
-      </w:r>
-      <w:r>
-        <w:t xml:space="preserve"> </w:t>
-      </w:r>
-      <w:r>
-        <w:t xml:space="preserve">tables directly. Couples to</w:t>
-      </w:r>
-      <w:r>
-        <w:t xml:space="preserve"> </w:t>
-      </w:r>
-      <w:r>
-        <w:rPr>
-          <w:b/>
-          <w:bCs/>
-        </w:rPr>
-        <w:t xml:space="preserve">UJ-19</w:t>
-      </w:r>
-      <w:r>
-        <w:t xml:space="preserve"> </w:t>
-      </w:r>
-      <w:r>
-        <w:t xml:space="preserve">+</w:t>
-      </w:r>
-      <w:r>
-        <w:t xml:space="preserve"> </w:t>
-      </w:r>
-      <w:r>
-        <w:rPr>
-          <w:b/>
-          <w:bCs/>
-        </w:rPr>
-        <w:t xml:space="preserve">OI-30</w:t>
-      </w:r>
-      <w:r>
-        <w:t xml:space="preserve"> </w:t>
-      </w:r>
-      <w:r>
-        <w:t xml:space="preserve">Reports tile contents.</w:t>
+        <w:t xml:space="preserve">QualitySpecAttributeId FK</w:t>
+      </w:r>
+      <w:r>
+        <w:t xml:space="preserve">,</w:t>
+      </w:r>
+      <w:r>
+        <w:t xml:space="preserve"> </w:t>
+      </w:r>
+      <w:r>
+        <w:rPr>
+          <w:rStyle w:val="VerbatimChar"/>
+        </w:rPr>
+        <w:t xml:space="preserve">MeasuredValue NVARCHAR</w:t>
+      </w:r>
+      <w:r>
+        <w:t xml:space="preserve">,</w:t>
+      </w:r>
+      <w:r>
+        <w:t xml:space="preserve"> </w:t>
+      </w:r>
+      <w:r>
+        <w:rPr>
+          <w:rStyle w:val="VerbatimChar"/>
+        </w:rPr>
+        <w:t xml:space="preserve">NumericValue DECIMAL(18,4) NULL</w:t>
+      </w:r>
+      <w:r>
+        <w:t xml:space="preserve"> </w:t>
+      </w:r>
+      <w:r>
+        <w:t xml:space="preserve">(v1.9p indexable shadow),</w:t>
+      </w:r>
+      <w:r>
+        <w:t xml:space="preserve"> </w:t>
+      </w:r>
+      <w:r>
+        <w:rPr>
+          <w:rStyle w:val="VerbatimChar"/>
+        </w:rPr>
+        <w:t xml:space="preserve">IsPass BIT</w:t>
+      </w:r>
+      <w:r>
+        <w:t xml:space="preserve">.</w:t>
       </w:r>
     </w:p>
     <w:p>
@@ -56738,16 +59029,27 @@
       </w:pPr>
       <w:r>
         <w:rPr>
+          <w:rStyle w:val="VerbatimChar"/>
+        </w:rPr>
+        <w:t xml:space="preserve">Quality.QualityAttachment</w:t>
+      </w:r>
+      <w:r>
+        <w:t xml:space="preserve"> </w:t>
+      </w:r>
+      <w:r>
+        <w:t xml:space="preserve">— CREATE. File metadata (CSV/XLSX/PDF/PNG/JPG to filesystem) linked to a sample.</w:t>
+      </w:r>
+    </w:p>
+    <w:p>
+      <w:pPr>
+        <w:pStyle w:val="FirstParagraph"/>
+      </w:pPr>
+      <w:r>
+        <w:rPr>
           <w:b/>
           <w:bCs/>
         </w:rPr>
-        <w:t xml:space="preserve">Macola integration.</w:t>
-      </w:r>
-      <w:r>
-        <w:t xml:space="preserve"> </w:t>
-      </w:r>
-      <w:r>
-        <w:t xml:space="preserve">FUTURE — not in this plan.</w:t>
+        <w:t xml:space="preserve">Controlled Run Tag (FDS-10-011 / 012):</w:t>
       </w:r>
     </w:p>
     <w:p>
@@ -56755,21 +59057,179 @@
         <w:pStyle w:val="Compact"/>
         <w:numPr>
           <w:ilvl w:val="0"/>
-          <w:numId w:val="1128"/>
+          <w:numId w:val="1129"/>
         </w:numPr>
       </w:pPr>
+      <w:r>
+        <w:t xml:space="preserve">Schema hook</w:t>
+      </w:r>
+      <w:r>
+        <w:t xml:space="preserve"> </w:t>
+      </w:r>
+      <w:r>
+        <w:rPr>
+          <w:rStyle w:val="VerbatimChar"/>
+        </w:rPr>
+        <w:t xml:space="preserve">Lots.Lot.CrtActive BIT</w:t>
+      </w:r>
+      <w:r>
+        <w:t xml:space="preserve"> </w:t>
+      </w:r>
+      <w:r>
+        <w:t xml:space="preserve">ships in</w:t>
+      </w:r>
+      <w:r>
+        <w:t xml:space="preserve"> </w:t>
+      </w:r>
       <w:r>
         <w:rPr>
           <w:b/>
           <w:bCs/>
         </w:rPr>
-        <w:t xml:space="preserve">Intelex integration.</w:t>
-      </w:r>
-      <w:r>
-        <w:t xml:space="preserve"> </w:t>
-      </w:r>
-      <w:r>
-        <w:t xml:space="preserve">FUTURE — NCM / Failure Analysis remains in Intelex separately. Phase 7’s hold mechanism is the operational disposition tool in MVP; formal NCM workflows stay in Intelex.</w:t>
+        <w:t xml:space="preserve">Phase 1</w:t>
+      </w:r>
+      <w:r>
+        <w:t xml:space="preserve"> </w:t>
+      </w:r>
+      <w:r>
+        <w:t xml:space="preserve">(Data Model v1.9q). Phase 9 seeds the CRT</w:t>
+      </w:r>
+      <w:r>
+        <w:t xml:space="preserve"> </w:t>
+      </w:r>
+      <w:r>
+        <w:rPr>
+          <w:rStyle w:val="VerbatimChar"/>
+        </w:rPr>
+        <w:t xml:space="preserve">Audit.LogEventType</w:t>
+      </w:r>
+      <w:r>
+        <w:t xml:space="preserve"> </w:t>
+      </w:r>
+      <w:r>
+        <w:t xml:space="preserve">rows (</w:t>
+      </w:r>
+      <w:r>
+        <w:rPr>
+          <w:rStyle w:val="VerbatimChar"/>
+        </w:rPr>
+        <w:t xml:space="preserve">CrtActivated</w:t>
+      </w:r>
+      <w:r>
+        <w:t xml:space="preserve">,</w:t>
+      </w:r>
+      <w:r>
+        <w:t xml:space="preserve"> </w:t>
+      </w:r>
+      <w:r>
+        <w:rPr>
+          <w:rStyle w:val="VerbatimChar"/>
+        </w:rPr>
+        <w:t xml:space="preserve">CrtCleared</w:t>
+      </w:r>
+      <w:r>
+        <w:t xml:space="preserve">,</w:t>
+      </w:r>
+      <w:r>
+        <w:t xml:space="preserve"> </w:t>
+      </w:r>
+      <w:r>
+        <w:rPr>
+          <w:rStyle w:val="VerbatimChar"/>
+        </w:rPr>
+        <w:t xml:space="preserve">MissedCrtInspect</w:t>
+      </w:r>
+      <w:r>
+        <w:t xml:space="preserve">) and builds the workflow: a CRT-active LOT requires a</w:t>
+      </w:r>
+      <w:r>
+        <w:t xml:space="preserve"> </w:t>
+      </w:r>
+      <w:r>
+        <w:rPr>
+          <w:rStyle w:val="VerbatimChar"/>
+        </w:rPr>
+        <w:t xml:space="preserve">QualitySample</w:t>
+      </w:r>
+      <w:r>
+        <w:t xml:space="preserve"> </w:t>
+      </w:r>
+      <w:r>
+        <w:t xml:space="preserve">per part on downstream operations (200% inspection); a missed inspection is flagged</w:t>
+      </w:r>
+      <w:r>
+        <w:t xml:space="preserve"> </w:t>
+      </w:r>
+      <w:r>
+        <w:rPr>
+          <w:rStyle w:val="VerbatimChar"/>
+        </w:rPr>
+        <w:t xml:space="preserve">MissedCrtInspect</w:t>
+      </w:r>
+      <w:r>
+        <w:t xml:space="preserve"> </w:t>
+      </w:r>
+      <w:r>
+        <w:t xml:space="preserve">and forces an operation re-run; clearance is a supervisor-AD-elevated release. No new table beyond the inspection tables above — the per-op inspection record</w:t>
+      </w:r>
+      <w:r>
+        <w:t xml:space="preserve"> </w:t>
+      </w:r>
+      <w:r>
+        <w:rPr>
+          <w:i/>
+          <w:iCs/>
+        </w:rPr>
+        <w:t xml:space="preserve">is</w:t>
+      </w:r>
+      <w:r>
+        <w:t xml:space="preserve"> </w:t>
+      </w:r>
+      <w:r>
+        <w:t xml:space="preserve">the</w:t>
+      </w:r>
+      <w:r>
+        <w:t xml:space="preserve"> </w:t>
+      </w:r>
+      <w:r>
+        <w:rPr>
+          <w:rStyle w:val="VerbatimChar"/>
+        </w:rPr>
+        <w:t xml:space="preserve">QualitySample</w:t>
+      </w:r>
+      <w:r>
+        <w:t xml:space="preserve"> </w:t>
+      </w:r>
+      <w:r>
+        <w:t xml:space="preserve">stream.</w:t>
+      </w:r>
+    </w:p>
+    <w:p>
+      <w:pPr>
+        <w:pStyle w:val="FirstParagraph"/>
+      </w:pPr>
+      <w:r>
+        <w:rPr>
+          <w:b/>
+          <w:bCs/>
+        </w:rPr>
+        <w:t xml:space="preserve">Global Trace (FDS-12-001 / 012 / 013 / 014):</w:t>
+      </w:r>
+      <w:r>
+        <w:t xml:space="preserve"> </w:t>
+      </w:r>
+      <w:r>
+        <w:t xml:space="preserve">no new tables — read-only over the existing LOT / genealogy / production / movement / hold / container / shipping tables.</w:t>
+      </w:r>
+    </w:p>
+    <w:bookmarkEnd w:id="178"/>
+    <w:bookmarkStart w:id="179" w:name="Xe957fa559196656f2a1bd732de5857ce5470dec"/>
+    <w:p>
+      <w:pPr>
+        <w:pStyle w:val="Heading2"/>
+      </w:pPr>
+      <w:r>
+        <w:t xml:space="preserve">API Layer (Named Queries -&gt; Stored Procedures)</w:t>
       </w:r>
     </w:p>
     <w:p>
@@ -56777,7 +59237,7 @@
         <w:pStyle w:val="Compact"/>
         <w:numPr>
           <w:ilvl w:val="0"/>
-          <w:numId w:val="1128"/>
+          <w:numId w:val="1130"/>
         </w:numPr>
       </w:pPr>
       <w:r>
@@ -56785,13 +59245,46 @@
           <w:b/>
           <w:bCs/>
         </w:rPr>
-        <w:t xml:space="preserve">Pixel-level Perspective mockups and Perspective JSON project exports.</w:t>
-      </w:r>
-      <w:r>
-        <w:t xml:space="preserve"> </w:t>
-      </w:r>
-      <w:r>
-        <w:t xml:space="preserve">Functional view descriptions only. Mockup production, if done, is a parallel workstream.</w:t>
+        <w:t xml:space="preserve">Inspection:</w:t>
+      </w:r>
+      <w:r>
+        <w:t xml:space="preserve"> </w:t>
+      </w:r>
+      <w:r>
+        <w:rPr>
+          <w:rStyle w:val="VerbatimChar"/>
+        </w:rPr>
+        <w:t xml:space="preserve">Quality.QualitySample_Record</w:t>
+      </w:r>
+      <w:r>
+        <w:t xml:space="preserve">,</w:t>
+      </w:r>
+      <w:r>
+        <w:t xml:space="preserve"> </w:t>
+      </w:r>
+      <w:r>
+        <w:rPr>
+          <w:rStyle w:val="VerbatimChar"/>
+        </w:rPr>
+        <w:t xml:space="preserve">QualitySample_GetByLot</w:t>
+      </w:r>
+      <w:r>
+        <w:t xml:space="preserve">, the</w:t>
+      </w:r>
+      <w:r>
+        <w:t xml:space="preserve"> </w:t>
+      </w:r>
+      <w:r>
+        <w:rPr>
+          <w:rStyle w:val="VerbatimChar"/>
+        </w:rPr>
+        <w:t xml:space="preserve">QualityResult</w:t>
+      </w:r>
+      <w:r>
+        <w:t xml:space="preserve"> </w:t>
+      </w:r>
+      <w:r>
+        <w:t xml:space="preserve">writers, an attachment-metadata writer.</w:t>
       </w:r>
     </w:p>
     <w:p>
@@ -56799,7 +59292,7 @@
         <w:pStyle w:val="Compact"/>
         <w:numPr>
           <w:ilvl w:val="0"/>
-          <w:numId w:val="1128"/>
+          <w:numId w:val="1130"/>
         </w:numPr>
       </w:pPr>
       <w:r>
@@ -56807,28 +59300,52 @@
           <w:b/>
           <w:bCs/>
         </w:rPr>
-        <w:t xml:space="preserve">Bit-level OPC tag addresses and PLC ladder logic.</w:t>
-      </w:r>
-      <w:r>
-        <w:t xml:space="preserve"> </w:t>
-      </w:r>
-      <w:r>
-        <w:t xml:space="preserve">See</w:t>
-      </w:r>
-      <w:r>
-        <w:t xml:space="preserve"> </w:t>
-      </w:r>
-      <w:r>
-        <w:rPr>
-          <w:rStyle w:val="VerbatimChar"/>
-        </w:rPr>
-        <w:t xml:space="preserve">reference/5GO_AP4_Automation_Touchpoint_Agreement.pdf</w:t>
-      </w:r>
-      <w:r>
-        <w:t xml:space="preserve"> </w:t>
-      </w:r>
-      <w:r>
-        <w:t xml:space="preserve">and FRS Appendix C.</w:t>
+        <w:t xml:space="preserve">CRT:</w:t>
+      </w:r>
+      <w:r>
+        <w:t xml:space="preserve"> </w:t>
+      </w:r>
+      <w:r>
+        <w:rPr>
+          <w:rStyle w:val="VerbatimChar"/>
+        </w:rPr>
+        <w:t xml:space="preserve">Lots.Lot_SetCrt</w:t>
+      </w:r>
+      <w:r>
+        <w:t xml:space="preserve"> </w:t>
+      </w:r>
+      <w:r>
+        <w:t xml:space="preserve">/</w:t>
+      </w:r>
+      <w:r>
+        <w:t xml:space="preserve"> </w:t>
+      </w:r>
+      <w:r>
+        <w:rPr>
+          <w:rStyle w:val="VerbatimChar"/>
+        </w:rPr>
+        <w:t xml:space="preserve">Lot_ClearCrt</w:t>
+      </w:r>
+      <w:r>
+        <w:t xml:space="preserve"> </w:t>
+      </w:r>
+      <w:r>
+        <w:t xml:space="preserve">(supervisor-elevated),</w:t>
+      </w:r>
+      <w:r>
+        <w:t xml:space="preserve"> </w:t>
+      </w:r>
+      <w:r>
+        <w:rPr>
+          <w:rStyle w:val="VerbatimChar"/>
+        </w:rPr>
+        <w:t xml:space="preserve">Quality.Crt_GetRequiredInspections</w:t>
+      </w:r>
+      <w:r>
+        <w:t xml:space="preserve"> </w:t>
+      </w:r>
+      <w:r>
+        <w:t xml:space="preserve">(200% gate); missed-inspect detection is consumed by the production procs.</w:t>
       </w:r>
     </w:p>
     <w:p>
@@ -56836,7 +59353,7 @@
         <w:pStyle w:val="Compact"/>
         <w:numPr>
           <w:ilvl w:val="0"/>
-          <w:numId w:val="1128"/>
+          <w:numId w:val="1130"/>
         </w:numPr>
       </w:pPr>
       <w:r>
@@ -56844,13 +59361,47 @@
           <w:b/>
           <w:bCs/>
         </w:rPr>
-        <w:t xml:space="preserve">Production-grade PLC firmware changes.</w:t>
-      </w:r>
-      <w:r>
-        <w:t xml:space="preserve"> </w:t>
-      </w:r>
-      <w:r>
-        <w:t xml:space="preserve">Assumed complete by PLC integrator before Phase 6 commissioning.</w:t>
+        <w:t xml:space="preserve">Global Trace:</w:t>
+      </w:r>
+      <w:r>
+        <w:t xml:space="preserve"> </w:t>
+      </w:r>
+      <w:r>
+        <w:rPr>
+          <w:rStyle w:val="VerbatimChar"/>
+        </w:rPr>
+        <w:t xml:space="preserve">Trace.GlobalTrace_Resolve</w:t>
+      </w:r>
+      <w:r>
+        <w:t xml:space="preserve"> </w:t>
+      </w:r>
+      <w:r>
+        <w:t xml:space="preserve">(LOT / Serial / Container / Shipper -&gt; entity + disambiguation),</w:t>
+      </w:r>
+      <w:r>
+        <w:t xml:space="preserve"> </w:t>
+      </w:r>
+      <w:r>
+        <w:rPr>
+          <w:rStyle w:val="VerbatimChar"/>
+        </w:rPr>
+        <w:t xml:space="preserve">GlobalTrace_GetFullTrace</w:t>
+      </w:r>
+      <w:r>
+        <w:t xml:space="preserve"> </w:t>
+      </w:r>
+      <w:r>
+        <w:t xml:space="preserve">(header + genealogy tree + production + movement + holds + shipping).</w:t>
+      </w:r>
+    </w:p>
+    <w:bookmarkEnd w:id="179"/>
+    <w:bookmarkStart w:id="180" w:name="perspective-views-9"/>
+    <w:p>
+      <w:pPr>
+        <w:pStyle w:val="Heading2"/>
+      </w:pPr>
+      <w:r>
+        <w:t xml:space="preserve">Perspective Views</w:t>
       </w:r>
     </w:p>
     <w:p>
@@ -56858,27 +59409,11 @@
         <w:pStyle w:val="Compact"/>
         <w:numPr>
           <w:ilvl w:val="0"/>
-          <w:numId w:val="1128"/>
+          <w:numId w:val="1131"/>
         </w:numPr>
       </w:pPr>
       <w:r>
-        <w:rPr>
-          <w:b/>
-          <w:bCs/>
-        </w:rPr>
-        <w:t xml:space="preserve">Material Allocation pre-production workflow</w:t>
-      </w:r>
-      <w:r>
-        <w:t xml:space="preserve"> </w:t>
-      </w:r>
-      <w:r>
-        <w:t xml:space="preserve">(OI-32). Pending Phase 0 confirmation; default closure direction is</w:t>
-      </w:r>
-      <w:r>
-        <w:t xml:space="preserve"> </w:t>
-      </w:r>
-      <w:r>
-        <w:t xml:space="preserve">“not reproduced — Flexware concept collapses into our existing LOT-at-Lineside-Cell + ConsumptionEvent model.”</w:t>
+        <w:t xml:space="preserve">Inspection Entry + Inspection History.</w:t>
       </w:r>
     </w:p>
     <w:p>
@@ -56886,21 +59421,141 @@
         <w:pStyle w:val="Compact"/>
         <w:numPr>
           <w:ilvl w:val="0"/>
-          <w:numId w:val="1128"/>
+          <w:numId w:val="1131"/>
         </w:numPr>
       </w:pPr>
       <w:r>
-        <w:rPr>
-          <w:b/>
-          <w:bCs/>
-        </w:rPr>
-        <w:t xml:space="preserve">Production schedule advanced uses</w:t>
-      </w:r>
-      <w:r>
-        <w:t xml:space="preserve"> </w:t>
-      </w:r>
-      <w:r>
-        <w:t xml:space="preserve">(OI-34). Current minimal use (shift-window timing only) is in scope; advanced uses (per-shift target quotas, drift detection, throughput planning) are Phase 0 / post-MVP.</w:t>
+        <w:t xml:space="preserve">Global Trace Tool (Track home tile, any context, read-only, Print/Export) + a printable LOT Genealogy Report.</w:t>
+      </w:r>
+    </w:p>
+    <w:p>
+      <w:pPr>
+        <w:pStyle w:val="Compact"/>
+        <w:numPr>
+          <w:ilvl w:val="0"/>
+          <w:numId w:val="1131"/>
+        </w:numPr>
+      </w:pPr>
+      <w:r>
+        <w:t xml:space="preserve">CRT controls fold into the existing LOT Detail + assembly/inspection screens (set/clear flag, 200%-inspect prompt, supervisor release).</w:t>
+      </w:r>
+    </w:p>
+    <w:bookmarkEnd w:id="180"/>
+    <w:bookmarkStart w:id="181" w:name="test-coverage-9"/>
+    <w:p>
+      <w:pPr>
+        <w:pStyle w:val="Heading2"/>
+      </w:pPr>
+      <w:r>
+        <w:t xml:space="preserve">Test Coverage</w:t>
+      </w:r>
+    </w:p>
+    <w:p>
+      <w:pPr>
+        <w:pStyle w:val="FirstParagraph"/>
+      </w:pPr>
+      <w:r>
+        <w:t xml:space="preserve">New suite</w:t>
+      </w:r>
+      <w:r>
+        <w:t xml:space="preserve"> </w:t>
+      </w:r>
+      <w:r>
+        <w:rPr>
+          <w:rStyle w:val="VerbatimChar"/>
+        </w:rPr>
+        <w:t xml:space="preserve">sql/tests/0028_PlantFloor_Quality_Capture/</w:t>
+      </w:r>
+      <w:r>
+        <w:t xml:space="preserve">: inspection record + pass/fail rollup + no-auto-hold (FDS-08-012); CRT activate/clear + 200% gate + missed-inspect re-run + elevated release; Global Trace resolve/disambiguation + full-trace assembly. Target ~70–95 assertions.</w:t>
+      </w:r>
+    </w:p>
+    <w:bookmarkEnd w:id="181"/>
+    <w:bookmarkStart w:id="182" w:name="phase-9-complete-when"/>
+    <w:p>
+      <w:pPr>
+        <w:pStyle w:val="Heading2"/>
+      </w:pPr>
+      <w:r>
+        <w:t xml:space="preserve">Phase 9 complete when</w:t>
+      </w:r>
+    </w:p>
+    <w:p>
+      <w:pPr>
+        <w:pStyle w:val="Compact"/>
+        <w:numPr>
+          <w:ilvl w:val="0"/>
+          <w:numId w:val="1132"/>
+        </w:numPr>
+      </w:pPr>
+      <w:r>
+        <w:t xml:space="preserve">Inspection recording end-to-end (sample + per-attribute results + attachments; a failed inspection alerts but does not auto-hold).</w:t>
+      </w:r>
+    </w:p>
+    <w:p>
+      <w:pPr>
+        <w:pStyle w:val="Compact"/>
+        <w:numPr>
+          <w:ilvl w:val="0"/>
+          <w:numId w:val="1133"/>
+        </w:numPr>
+      </w:pPr>
+      <w:r>
+        <w:t xml:space="preserve">CRT workflow: activate -&gt; 200% downstream inspection enforced -&gt; missed inspection flagged + re-run -&gt; supervisor-elevated clearance; audit rows for each.</w:t>
+      </w:r>
+    </w:p>
+    <w:p>
+      <w:pPr>
+        <w:pStyle w:val="Compact"/>
+        <w:numPr>
+          <w:ilvl w:val="0"/>
+          <w:numId w:val="1134"/>
+        </w:numPr>
+      </w:pPr>
+      <w:r>
+        <w:t xml:space="preserve">Global Trace Tool resolves any LOT / Serial / Container / Shipper and renders the full read-only trace with Print/Export; LOT Genealogy Report prints.</w:t>
+      </w:r>
+    </w:p>
+    <w:p>
+      <w:pPr>
+        <w:pStyle w:val="Compact"/>
+        <w:numPr>
+          <w:ilvl w:val="0"/>
+          <w:numId w:val="1135"/>
+        </w:numPr>
+      </w:pPr>
+      <w:r>
+        <w:t xml:space="preserve">Migration</w:t>
+      </w:r>
+      <w:r>
+        <w:t xml:space="preserve"> </w:t>
+      </w:r>
+      <w:r>
+        <w:rPr>
+          <w:rStyle w:val="VerbatimChar"/>
+        </w:rPr>
+        <w:t xml:space="preserve">0028_arc2_phase9_quality_capture.sql</w:t>
+      </w:r>
+      <w:r>
+        <w:t xml:space="preserve"> </w:t>
+      </w:r>
+      <w:r>
+        <w:t xml:space="preserve">applied; suite</w:t>
+      </w:r>
+      <w:r>
+        <w:t xml:space="preserve"> </w:t>
+      </w:r>
+      <w:r>
+        <w:rPr>
+          <w:rStyle w:val="VerbatimChar"/>
+        </w:rPr>
+        <w:t xml:space="preserve">0028_PlantFloor_Quality_Capture/</w:t>
+      </w:r>
+      <w:r>
+        <w:t xml:space="preserve"> </w:t>
+      </w:r>
+      <w:r>
+        <w:t xml:space="preserve">passes.</w:t>
       </w:r>
     </w:p>
     <w:p>
@@ -56910,8 +59565,437 @@
         </w:pict>
       </w:r>
     </w:p>
-    <w:bookmarkEnd w:id="177"/>
-    <w:bookmarkStart w:id="178" w:name="open-items-affecting-this-plan"/>
+    <w:bookmarkEnd w:id="182"/>
+    <w:bookmarkStart w:id="183" w:name="out-of-scope"/>
+    <w:p>
+      <w:pPr>
+        <w:pStyle w:val="Heading2"/>
+      </w:pPr>
+      <w:r>
+        <w:t xml:space="preserve">Out of Scope</w:t>
+      </w:r>
+    </w:p>
+    <w:p>
+      <w:pPr>
+        <w:pStyle w:val="FirstParagraph"/>
+      </w:pPr>
+      <w:r>
+        <w:t xml:space="preserve">Explicitly excluded from this plan — handled elsewhere or deferred:</w:t>
+      </w:r>
+    </w:p>
+    <w:p>
+      <w:pPr>
+        <w:pStyle w:val="Compact"/>
+        <w:numPr>
+          <w:ilvl w:val="0"/>
+          <w:numId w:val="1136"/>
+        </w:numPr>
+      </w:pPr>
+      <w:r>
+        <w:rPr>
+          <w:b/>
+          <w:bCs/>
+        </w:rPr>
+        <w:t xml:space="preserve">OEE Snapshot calculation.</w:t>
+      </w:r>
+      <w:r>
+        <w:t xml:space="preserve"> </w:t>
+      </w:r>
+      <w:r>
+        <w:rPr>
+          <w:rStyle w:val="VerbatimChar"/>
+        </w:rPr>
+        <w:t xml:space="preserve">Oee.OeeSnapshot</w:t>
+      </w:r>
+      <w:r>
+        <w:t xml:space="preserve"> </w:t>
+      </w:r>
+      <w:r>
+        <w:t xml:space="preserve">table exists in the data model as FUTURE scope. No Phase is dedicated to it; no stored procs, no Gateway scripts. Post-MVP workstream.</w:t>
+      </w:r>
+    </w:p>
+    <w:p>
+      <w:pPr>
+        <w:pStyle w:val="Compact"/>
+        <w:numPr>
+          <w:ilvl w:val="0"/>
+          <w:numId w:val="1136"/>
+        </w:numPr>
+      </w:pPr>
+      <w:r>
+        <w:rPr>
+          <w:b/>
+          <w:bCs/>
+        </w:rPr>
+        <w:t xml:space="preserve">Reporting split (ratified 2026-06-08).</w:t>
+      </w:r>
+      <w:r>
+        <w:t xml:space="preserve"> </w:t>
+      </w:r>
+      <w:r>
+        <w:t xml:space="preserve">The</w:t>
+      </w:r>
+      <w:r>
+        <w:t xml:space="preserve"> </w:t>
+      </w:r>
+      <w:r>
+        <w:rPr>
+          <w:b/>
+          <w:bCs/>
+        </w:rPr>
+        <w:t xml:space="preserve">LOT Genealogy Report</w:t>
+      </w:r>
+      <w:r>
+        <w:t xml:space="preserve"> </w:t>
+      </w:r>
+      <w:r>
+        <w:t xml:space="preserve">and the</w:t>
+      </w:r>
+      <w:r>
+        <w:t xml:space="preserve"> </w:t>
+      </w:r>
+      <w:r>
+        <w:rPr>
+          <w:b/>
+          <w:bCs/>
+        </w:rPr>
+        <w:t xml:space="preserve">Global Trace Tool</w:t>
+      </w:r>
+      <w:r>
+        <w:t xml:space="preserve"> </w:t>
+      </w:r>
+      <w:r>
+        <w:t xml:space="preserve">(FDS-12-001 / 012 / 013 / 014 — primary Honda traceability) are</w:t>
+      </w:r>
+      <w:r>
+        <w:t xml:space="preserve"> </w:t>
+      </w:r>
+      <w:r>
+        <w:rPr>
+          <w:b/>
+          <w:bCs/>
+        </w:rPr>
+        <w:t xml:space="preserve">MVP and in-scope</w:t>
+      </w:r>
+      <w:r>
+        <w:t xml:space="preserve">, built in</w:t>
+      </w:r>
+      <w:r>
+        <w:t xml:space="preserve"> </w:t>
+      </w:r>
+      <w:r>
+        <w:rPr>
+          <w:b/>
+          <w:bCs/>
+        </w:rPr>
+        <w:t xml:space="preserve">Phase 9</w:t>
+      </w:r>
+      <w:r>
+        <w:t xml:space="preserve"> </w:t>
+      </w:r>
+      <w:r>
+        <w:t xml:space="preserve">(they read existing event tables; not gated on UJ-19). The four legacy Productivity-Database operational reports (Die Shot, Rejects, Downtime, Production)</w:t>
+      </w:r>
+      <w:r>
+        <w:t xml:space="preserve"> </w:t>
+      </w:r>
+      <w:r>
+        <w:rPr>
+          <w:b/>
+          <w:bCs/>
+        </w:rPr>
+        <w:t xml:space="preserve">and Shipping History</w:t>
+      </w:r>
+      <w:r>
+        <w:t xml:space="preserve"> </w:t>
+      </w:r>
+      <w:r>
+        <w:t xml:space="preserve">are</w:t>
+      </w:r>
+      <w:r>
+        <w:t xml:space="preserve"> </w:t>
+      </w:r>
+      <w:r>
+        <w:rPr>
+          <w:b/>
+          <w:bCs/>
+        </w:rPr>
+        <w:t xml:space="preserve">deferred to near/post-deployment</w:t>
+      </w:r>
+      <w:r>
+        <w:t xml:space="preserve">: a separate Reporting workstream (Ignition Reporting module over</w:t>
+      </w:r>
+      <w:r>
+        <w:t xml:space="preserve"> </w:t>
+      </w:r>
+      <w:r>
+        <w:rPr>
+          <w:rStyle w:val="VerbatimChar"/>
+        </w:rPr>
+        <w:t xml:space="preserve">ProductionEvent</w:t>
+      </w:r>
+      <w:r>
+        <w:t xml:space="preserve"> </w:t>
+      </w:r>
+      <w:r>
+        <w:t xml:space="preserve">/</w:t>
+      </w:r>
+      <w:r>
+        <w:t xml:space="preserve"> </w:t>
+      </w:r>
+      <w:r>
+        <w:rPr>
+          <w:rStyle w:val="VerbatimChar"/>
+        </w:rPr>
+        <w:t xml:space="preserve">RejectEvent</w:t>
+      </w:r>
+      <w:r>
+        <w:t xml:space="preserve"> </w:t>
+      </w:r>
+      <w:r>
+        <w:t xml:space="preserve">/</w:t>
+      </w:r>
+      <w:r>
+        <w:t xml:space="preserve"> </w:t>
+      </w:r>
+      <w:r>
+        <w:rPr>
+          <w:rStyle w:val="VerbatimChar"/>
+        </w:rPr>
+        <w:t xml:space="preserve">DowntimeEvent</w:t>
+      </w:r>
+      <w:r>
+        <w:t xml:space="preserve"> </w:t>
+      </w:r>
+      <w:r>
+        <w:t xml:space="preserve">/</w:t>
+      </w:r>
+      <w:r>
+        <w:t xml:space="preserve"> </w:t>
+      </w:r>
+      <w:r>
+        <w:rPr>
+          <w:rStyle w:val="VerbatimChar"/>
+        </w:rPr>
+        <w:t xml:space="preserve">Shift</w:t>
+      </w:r>
+      <w:r>
+        <w:t xml:space="preserve">), gated on</w:t>
+      </w:r>
+      <w:r>
+        <w:t xml:space="preserve"> </w:t>
+      </w:r>
+      <w:r>
+        <w:rPr>
+          <w:b/>
+          <w:bCs/>
+        </w:rPr>
+        <w:t xml:space="preserve">UJ-19</w:t>
+      </w:r>
+      <w:r>
+        <w:t xml:space="preserve"> </w:t>
+      </w:r>
+      <w:r>
+        <w:t xml:space="preserve">(MPP names the four PD reports + data sources) +</w:t>
+      </w:r>
+      <w:r>
+        <w:t xml:space="preserve"> </w:t>
+      </w:r>
+      <w:r>
+        <w:rPr>
+          <w:b/>
+          <w:bCs/>
+        </w:rPr>
+        <w:t xml:space="preserve">OI-30</w:t>
+      </w:r>
+      <w:r>
+        <w:t xml:space="preserve">.</w:t>
+      </w:r>
+    </w:p>
+    <w:p>
+      <w:pPr>
+        <w:pStyle w:val="Compact"/>
+        <w:numPr>
+          <w:ilvl w:val="0"/>
+          <w:numId w:val="1136"/>
+        </w:numPr>
+      </w:pPr>
+      <w:r>
+        <w:rPr>
+          <w:b/>
+          <w:bCs/>
+        </w:rPr>
+        <w:t xml:space="preserve">Macola integration.</w:t>
+      </w:r>
+      <w:r>
+        <w:t xml:space="preserve"> </w:t>
+      </w:r>
+      <w:r>
+        <w:t xml:space="preserve">FUTURE — not in this plan.</w:t>
+      </w:r>
+    </w:p>
+    <w:p>
+      <w:pPr>
+        <w:pStyle w:val="Compact"/>
+        <w:numPr>
+          <w:ilvl w:val="0"/>
+          <w:numId w:val="1136"/>
+        </w:numPr>
+      </w:pPr>
+      <w:r>
+        <w:rPr>
+          <w:b/>
+          <w:bCs/>
+        </w:rPr>
+        <w:t xml:space="preserve">Intelex integration.</w:t>
+      </w:r>
+      <w:r>
+        <w:t xml:space="preserve"> </w:t>
+      </w:r>
+      <w:r>
+        <w:t xml:space="preserve">FUTURE — NCM / Failure Analysis remains in Intelex separately. Phase 7’s hold mechanism is the operational disposition tool in MVP; formal NCM workflows stay in Intelex.</w:t>
+      </w:r>
+    </w:p>
+    <w:p>
+      <w:pPr>
+        <w:pStyle w:val="Compact"/>
+        <w:numPr>
+          <w:ilvl w:val="0"/>
+          <w:numId w:val="1136"/>
+        </w:numPr>
+      </w:pPr>
+      <w:r>
+        <w:rPr>
+          <w:b/>
+          <w:bCs/>
+        </w:rPr>
+        <w:t xml:space="preserve">Pixel-level Perspective mockups and Perspective JSON project exports.</w:t>
+      </w:r>
+      <w:r>
+        <w:t xml:space="preserve"> </w:t>
+      </w:r>
+      <w:r>
+        <w:t xml:space="preserve">Functional view descriptions only. Mockup production, if done, is a parallel workstream.</w:t>
+      </w:r>
+    </w:p>
+    <w:p>
+      <w:pPr>
+        <w:pStyle w:val="Compact"/>
+        <w:numPr>
+          <w:ilvl w:val="0"/>
+          <w:numId w:val="1136"/>
+        </w:numPr>
+      </w:pPr>
+      <w:r>
+        <w:rPr>
+          <w:b/>
+          <w:bCs/>
+        </w:rPr>
+        <w:t xml:space="preserve">Bit-level OPC tag addresses and PLC ladder logic.</w:t>
+      </w:r>
+      <w:r>
+        <w:t xml:space="preserve"> </w:t>
+      </w:r>
+      <w:r>
+        <w:t xml:space="preserve">See</w:t>
+      </w:r>
+      <w:r>
+        <w:t xml:space="preserve"> </w:t>
+      </w:r>
+      <w:r>
+        <w:rPr>
+          <w:rStyle w:val="VerbatimChar"/>
+        </w:rPr>
+        <w:t xml:space="preserve">reference/5GO_AP4_Automation_Touchpoint_Agreement.pdf</w:t>
+      </w:r>
+      <w:r>
+        <w:t xml:space="preserve"> </w:t>
+      </w:r>
+      <w:r>
+        <w:t xml:space="preserve">and FRS Appendix C.</w:t>
+      </w:r>
+    </w:p>
+    <w:p>
+      <w:pPr>
+        <w:pStyle w:val="Compact"/>
+        <w:numPr>
+          <w:ilvl w:val="0"/>
+          <w:numId w:val="1136"/>
+        </w:numPr>
+      </w:pPr>
+      <w:r>
+        <w:rPr>
+          <w:b/>
+          <w:bCs/>
+        </w:rPr>
+        <w:t xml:space="preserve">Production-grade PLC firmware changes.</w:t>
+      </w:r>
+      <w:r>
+        <w:t xml:space="preserve"> </w:t>
+      </w:r>
+      <w:r>
+        <w:t xml:space="preserve">Assumed complete by PLC integrator before Phase 6 commissioning.</w:t>
+      </w:r>
+    </w:p>
+    <w:p>
+      <w:pPr>
+        <w:pStyle w:val="Compact"/>
+        <w:numPr>
+          <w:ilvl w:val="0"/>
+          <w:numId w:val="1136"/>
+        </w:numPr>
+      </w:pPr>
+      <w:r>
+        <w:rPr>
+          <w:b/>
+          <w:bCs/>
+        </w:rPr>
+        <w:t xml:space="preserve">Material Allocation pre-production workflow</w:t>
+      </w:r>
+      <w:r>
+        <w:t xml:space="preserve"> </w:t>
+      </w:r>
+      <w:r>
+        <w:t xml:space="preserve">(OI-32). Pending Phase 0 confirmation; default closure direction is</w:t>
+      </w:r>
+      <w:r>
+        <w:t xml:space="preserve"> </w:t>
+      </w:r>
+      <w:r>
+        <w:t xml:space="preserve">“not reproduced — Flexware concept collapses into our existing LOT-at-Lineside-Cell + ConsumptionEvent model.”</w:t>
+      </w:r>
+    </w:p>
+    <w:p>
+      <w:pPr>
+        <w:pStyle w:val="Compact"/>
+        <w:numPr>
+          <w:ilvl w:val="0"/>
+          <w:numId w:val="1136"/>
+        </w:numPr>
+      </w:pPr>
+      <w:r>
+        <w:rPr>
+          <w:b/>
+          <w:bCs/>
+        </w:rPr>
+        <w:t xml:space="preserve">Production schedule advanced uses</w:t>
+      </w:r>
+      <w:r>
+        <w:t xml:space="preserve"> </w:t>
+      </w:r>
+      <w:r>
+        <w:t xml:space="preserve">(OI-34). Current minimal use (shift-window timing only) is in scope; advanced uses (per-shift target quotas, drift detection, throughput planning) are Phase 0 / post-MVP.</w:t>
+      </w:r>
+    </w:p>
+    <w:p>
+      <w:r>
+        <w:pict>
+          <v:rect style="width:0;height:1.5pt" o:hralign="center" o:hrstd="t" o:hr="t"/>
+        </w:pict>
+      </w:r>
+    </w:p>
+    <w:bookmarkEnd w:id="183"/>
+    <w:bookmarkStart w:id="184" w:name="open-items-affecting-this-plan"/>
     <w:p>
       <w:pPr>
         <w:pStyle w:val="Heading2"/>
@@ -57961,8 +61045,8 @@
         </w:pict>
       </w:r>
     </w:p>
-    <w:bookmarkEnd w:id="178"/>
-    <w:bookmarkStart w:id="179" w:name="related-documents"/>
+    <w:bookmarkEnd w:id="184"/>
+    <w:bookmarkStart w:id="185" w:name="related-documents"/>
     <w:p>
       <w:pPr>
         <w:pStyle w:val="Heading2"/>
@@ -58116,7 +61200,7 @@
               <w:pStyle w:val="Compact"/>
             </w:pPr>
             <w:r>
-              <w:t xml:space="preserve">v1.9l</w:t>
+              <w:t xml:space="preserve">v1.9o</w:t>
             </w:r>
           </w:p>
         </w:tc>
@@ -58157,7 +61241,7 @@
               <w:pStyle w:val="Compact"/>
             </w:pPr>
             <w:r>
-              <w:t xml:space="preserve">v0.11m</w:t>
+              <w:t xml:space="preserve">v1.3</w:t>
             </w:r>
           </w:p>
         </w:tc>
@@ -58684,8 +61768,8 @@
         </w:tc>
       </w:tr>
     </w:tbl>
-    <w:bookmarkEnd w:id="179"/>
-    <w:bookmarkEnd w:id="180"/>
+    <w:bookmarkEnd w:id="185"/>
+    <w:bookmarkEnd w:id="186"/>
     <w:sectPr>
       <w:footnotePr>
         <w:numRestart w:val="eachSect"/>
@@ -60041,6 +63125,30 @@
   <w:num w:numId="1128">
     <w:abstractNumId w:val="991"/>
   </w:num>
+  <w:num w:numId="1129">
+    <w:abstractNumId w:val="991"/>
+  </w:num>
+  <w:num w:numId="1130">
+    <w:abstractNumId w:val="991"/>
+  </w:num>
+  <w:num w:numId="1131">
+    <w:abstractNumId w:val="991"/>
+  </w:num>
+  <w:num w:numId="1132">
+    <w:abstractNumId w:val="992"/>
+  </w:num>
+  <w:num w:numId="1133">
+    <w:abstractNumId w:val="992"/>
+  </w:num>
+  <w:num w:numId="1134">
+    <w:abstractNumId w:val="992"/>
+  </w:num>
+  <w:num w:numId="1135">
+    <w:abstractNumId w:val="992"/>
+  </w:num>
+  <w:num w:numId="1136">
+    <w:abstractNumId w:val="991"/>
+  </w:num>
 </w:numbering>
 </file>
 

</xml_diff>